<commit_message>
docs: integrate exact Tailwind CTA button HTML snippet, demo card, and utility breakdown table into report Step 5
</commit_message>
<xml_diff>
--- a/FirstSemester/web/lab6/Лемішка_ПП-24_Л6_ChargeUA.docx
+++ b/FirstSemester/web/lab6/Лемішка_ПП-24_Л6_ChargeUA.docx
@@ -1037,7 +1037,7 @@
         <w:jc w:val="both"/>
       </w:pPr>
       <w:r>
-        <w:t>За допомогою ШІ-чату було сформульовано системний промпт для створення кнопки Primary CTA Button «Знайти станцію» із дотриманням суворих вимог доступності (WCAG) та ергономіки тач-пристроїв.</w:t>
+        <w:t>За допомогою ШІ-чату було сформульовано системний промпт для розробки кнопки Primary CTA Button «Знайти станцію» для вебплатформи ChargeUA виключно засобами HTML5 та Tailwind CSS. При проєктуванні враховано суворі вимоги міжнародних стандартів доступності WCAG 2.1 (Success Criterion 2.5.5 / 2.5.8 Target Size), контрастності кольорів (SC 1.4.3 Contrast Minimum) та підтримки навігації з клавіатури за стандартом WAI-ARIA.</w:t>
       </w:r>
     </w:p>
     <w:p>
@@ -1110,7 +1110,7 @@
                 <w:i w:val="0"/>
                 <w:sz w:val="22"/>
               </w:rPr>
-              <w:t xml:space="preserve">Запит: </w:t>
+              <w:t xml:space="preserve">Системний запит (Prompt): </w:t>
             </w:r>
             <w:r>
               <w:rPr>
@@ -1119,7 +1119,27 @@
                 <w:i/>
                 <w:sz w:val="22"/>
               </w:rPr>
-              <w:t>«Ти — Senior Frontend Developer та UI/UX Engineer. Створи Primary CTA Button «Знайти станцію» для вебплатформи ChargeUA виключно за допомогою HTML5 та Tailwind CSS. Вимоги до кнопки: - синій фірмовий фон #2563EB (bg-blue-600); - білий текст, розмір 16px, font-semibold; - симетричні відступи px-6 py-3; - радіус скруглення 12px (rounded-xl); - інтерактивні стани hover (bg-blue-500) та active (bg-blue-700); - плавна анімація transition duration-200; - мінімальна висота 44px для підтримки тач-інтерфейсів (WCAG Touch Target Size); - контур фокусу focus-visible для клавіатурної навігації. Кнопка має бути суто пошуковою (ніяких кнопок бронювання чи оплати). Поясни всі застосовані класи.»</w:t>
+              <w:t>«Ти — Senior Frontend Developer та UI/UX Engineer. Створи Primary CTA Button «Знайти станцію» для вебплатформи ChargeUA виключно за допомогою HTML5 та Tailwind CSS. Вимоги до кнопки:</w:t>
+              <w:br/>
+              <w:t>- синій фірмовий фон #2563EB (bg-blue-600);</w:t>
+              <w:br/>
+              <w:t>- білий текст, кегль 16px, font-semibold;</w:t>
+              <w:br/>
+              <w:t>- симетричні внутрішні відступи px-6 py-3;</w:t>
+              <w:br/>
+              <w:t>- радіус скруглення 12px (rounded-xl);</w:t>
+              <w:br/>
+              <w:t>- інтерактивні стани hover (bg-blue-700) та active (bg-blue-800);</w:t>
+              <w:br/>
+              <w:t>- плавна анімація переходу transition-all duration-200;</w:t>
+              <w:br/>
+              <w:t>- мінімальна висота 44px для підтримки тач-інтерфейсів (WCAG Touch Target Size);</w:t>
+              <w:br/>
+              <w:t>- контур фокусу focus-visible для клавіатурної навігації (Tab) без дефектів миші;</w:t>
+              <w:br/>
+              <w:t>- векторна SVG-іконка стрілки праворуч із мікроанімацією зсуву при hover.</w:t>
+              <w:br/>
+              <w:t>Кнопка має бути суто пошуковою (ніяких кнопок бронювання чи оплати). Надай чистий HTML-код та розбір утилітарних класів.»</w:t>
             </w:r>
           </w:p>
         </w:tc>
@@ -1142,55 +1162,7 @@
           <w:i w:val="0"/>
           <w:sz w:val="24"/>
         </w:rPr>
-        <w:t xml:space="preserve">Результат генерації: </w:t>
-      </w:r>
-      <w:r>
-        <w:rPr>
-          <w:rFonts w:ascii="Times New Roman" w:hAnsi="Times New Roman" w:cs="Times New Roman"/>
-          <w:b w:val="0"/>
-          <w:i w:val="0"/>
-          <w:sz w:val="24"/>
-        </w:rPr>
-        <w:t>Отримано семантичний код кнопки із вбудованою SVG-іконкою стрілки, ефектами плавної зміни фону та розміром 44px.</w:t>
-      </w:r>
-    </w:p>
-    <w:p>
-      <w:pPr>
-        <w:spacing w:before="40" w:after="40" w:line="276" w:lineRule="auto"/>
-        <w:jc w:val="both"/>
-      </w:pPr>
-      <w:r>
-        <w:rPr>
-          <w:rFonts w:ascii="Times New Roman" w:hAnsi="Times New Roman" w:cs="Times New Roman"/>
-          <w:b/>
-          <w:i w:val="0"/>
-          <w:sz w:val="24"/>
-        </w:rPr>
-        <w:t xml:space="preserve">Аналіз недоліків: </w:t>
-      </w:r>
-      <w:r>
-        <w:rPr>
-          <w:rFonts w:ascii="Times New Roman" w:hAnsi="Times New Roman" w:cs="Times New Roman"/>
-          <w:b w:val="0"/>
-          <w:i w:val="0"/>
-          <w:sz w:val="24"/>
-        </w:rPr>
-        <w:t>Кнопка потребувала валідації в реальному темному оточенні поруч із карткою зарядної станції у пісочниці Tailwind Play.</w:t>
-      </w:r>
-    </w:p>
-    <w:p>
-      <w:pPr>
-        <w:spacing w:before="40" w:after="40" w:line="276" w:lineRule="auto"/>
-        <w:jc w:val="both"/>
-      </w:pPr>
-      <w:r>
-        <w:rPr>
-          <w:rFonts w:ascii="Times New Roman" w:hAnsi="Times New Roman" w:cs="Times New Roman"/>
-          <w:b/>
-          <w:i w:val="0"/>
-          <w:sz w:val="24"/>
-        </w:rPr>
-        <w:t>Крок 2. Коригувальний запит та тестування у Tailwind Play</w:t>
+        <w:t>Результат генерації коду кнопки (HTML5 + Tailwind CSS):</w:t>
       </w:r>
     </w:p>
     <w:tbl>
@@ -1232,7 +1204,7 @@
                 <w:i w:val="0"/>
                 <w:sz w:val="22"/>
               </w:rPr>
-              <w:t xml:space="preserve">Запит: </w:t>
+              <w:t xml:space="preserve">Вихідний HTML-код кнопки (Primary CTA Button): </w:t>
             </w:r>
             <w:r>
               <w:rPr>
@@ -1241,7 +1213,885 @@
                 <w:i/>
                 <w:sz w:val="22"/>
               </w:rPr>
-              <w:t>«Додай до кнопки ефект світіння shadow-lg shadow-blue-600/30 і розмісти її всередині демонстраційної картки станції з темним фоном bg-slate-800, зеленим пульсуючим бейджем вільного порту (120 кВт CCS2) та адресою в Києві для тестування в Tailwind Play.»</w:t>
+              <w:t>&lt;button type="button"</w:t>
+              <w:br/>
+              <w:t xml:space="preserve">        class="inline-flex items-center justify-center gap-2 px-6 py-3 min-h-[44px] bg-blue-600 hover:bg-blue-700 active:bg-blue-800 text-white font-semibold text-base rounded-xl shadow-md shadow-blue-500/25 transition-all duration-200 focus-visible:outline-none focus-visible:ring-2 focus-visible:ring-blue-500 focus-visible:ring-offset-2 dark:focus-visible:ring-offset-slate-900 select-none cursor-pointer"&gt;</w:t>
+              <w:br/>
+              <w:t xml:space="preserve">  &lt;span&gt;Знайти станцію&lt;/span&gt;</w:t>
+              <w:br/>
+              <w:t xml:space="preserve">  &lt;svg class="w-5 h-5 transition-transform duration-200 group-hover:translate-x-0.5" fill="none" viewBox="0 0 24 24" stroke="currentColor" stroke-width="2" aria-hidden="true"&gt;</w:t>
+              <w:br/>
+              <w:t xml:space="preserve">    &lt;path stroke-linecap="round" stroke-linejoin="round" d="M13.5 4.5L21 12m0 0l-7.5 7.5M21 12H3" /&gt;</w:t>
+              <w:br/>
+              <w:t xml:space="preserve">  &lt;/svg&gt;</w:t>
+              <w:br/>
+              <w:t>&lt;/button&gt;</w:t>
+            </w:r>
+          </w:p>
+        </w:tc>
+      </w:tr>
+    </w:tbl>
+    <w:p>
+      <w:pPr>
+        <w:spacing w:before="0" w:after="80"/>
+      </w:pPr>
+    </w:p>
+    <w:p>
+      <w:pPr>
+        <w:spacing w:before="40" w:after="60" w:line="276" w:lineRule="auto"/>
+        <w:jc w:val="both"/>
+      </w:pPr>
+      <w:r>
+        <w:rPr>
+          <w:rFonts w:ascii="Times New Roman" w:hAnsi="Times New Roman" w:cs="Times New Roman"/>
+          <w:b/>
+          <w:i w:val="0"/>
+          <w:sz w:val="24"/>
+        </w:rPr>
+        <w:t>Анатомія та декомпозиція застосованих утилітарних класів Tailwind CSS:</w:t>
+      </w:r>
+    </w:p>
+    <w:tbl>
+      <w:tblPr>
+        <w:tblW w:type="auto" w:w="0"/>
+        <w:jc w:val="center"/>
+        <w:tblLook w:firstColumn="1" w:firstRow="1" w:lastColumn="0" w:lastRow="0" w:noHBand="0" w:noVBand="1" w:val="04A0"/>
+        <w:tblBorders>
+          <w:top w:val="single" w:sz="4" w:space="0" w:color="D3D3D3"/>
+          <w:bottom w:val="single" w:sz="4" w:space="0" w:color="D3D3D3"/>
+          <w:left w:val="single" w:sz="4" w:space="0" w:color="D3D3D3"/>
+          <w:right w:val="single" w:sz="4" w:space="0" w:color="D3D3D3"/>
+          <w:insideH w:val="single" w:sz="4" w:space="0" w:color="D3D3D3"/>
+          <w:insideV w:val="single" w:sz="4" w:space="0" w:color="D3D3D3"/>
+        </w:tblBorders>
+      </w:tblPr>
+      <w:tblGrid>
+        <w:gridCol w:w="4820"/>
+        <w:gridCol w:w="4820"/>
+      </w:tblGrid>
+      <w:tr>
+        <w:trPr>
+          <w:tblHeader/>
+        </w:trPr>
+        <w:tc>
+          <w:tcPr>
+            <w:tcW w:type="dxa" w:w="3600"/>
+            <w:shd w:fill="EAEAEA"/>
+            <w:tcMar>
+              <w:top w:w="100" w:type="dxa"/>
+              <w:bottom w:w="100" w:type="dxa"/>
+              <w:left w:w="150" w:type="dxa"/>
+              <w:right w:w="150" w:type="dxa"/>
+            </w:tcMar>
+          </w:tcPr>
+          <w:p>
+            <w:pPr>
+              <w:spacing w:before="40" w:after="40"/>
+              <w:jc w:val="center"/>
+            </w:pPr>
+            <w:r>
+              <w:rPr>
+                <w:rFonts w:ascii="Times New Roman" w:hAnsi="Times New Roman" w:cs="Times New Roman"/>
+                <w:b/>
+                <w:i w:val="0"/>
+                <w:sz w:val="20"/>
+              </w:rPr>
+              <w:t>Утилітарний клас Tailwind CSS</w:t>
+            </w:r>
+          </w:p>
+        </w:tc>
+        <w:tc>
+          <w:tcPr>
+            <w:tcW w:type="dxa" w:w="6048"/>
+            <w:shd w:fill="EAEAEA"/>
+            <w:tcMar>
+              <w:top w:w="100" w:type="dxa"/>
+              <w:bottom w:w="100" w:type="dxa"/>
+              <w:left w:w="150" w:type="dxa"/>
+              <w:right w:w="150" w:type="dxa"/>
+            </w:tcMar>
+          </w:tcPr>
+          <w:p>
+            <w:pPr>
+              <w:spacing w:before="40" w:after="40"/>
+              <w:jc w:val="center"/>
+            </w:pPr>
+            <w:r>
+              <w:rPr>
+                <w:rFonts w:ascii="Times New Roman" w:hAnsi="Times New Roman" w:cs="Times New Roman"/>
+                <w:b/>
+                <w:i w:val="0"/>
+                <w:sz w:val="20"/>
+              </w:rPr>
+              <w:t>Призначення, CSS-еквівалент та відповідність стандартам</w:t>
+            </w:r>
+          </w:p>
+        </w:tc>
+      </w:tr>
+      <w:tr>
+        <w:tc>
+          <w:tcPr>
+            <w:tcW w:type="dxa" w:w="3600"/>
+            <w:shd w:fill="FFFFFF"/>
+            <w:tcMar>
+              <w:top w:w="80" w:type="dxa"/>
+              <w:bottom w:w="80" w:type="dxa"/>
+              <w:left w:w="150" w:type="dxa"/>
+              <w:right w:w="150" w:type="dxa"/>
+            </w:tcMar>
+          </w:tcPr>
+          <w:p>
+            <w:pPr>
+              <w:spacing w:before="40" w:after="40" w:line="276" w:lineRule="auto"/>
+              <w:jc w:val="left"/>
+            </w:pPr>
+            <w:r>
+              <w:rPr>
+                <w:rFonts w:ascii="Times New Roman" w:hAnsi="Times New Roman" w:cs="Times New Roman"/>
+                <w:b/>
+                <w:i w:val="0"/>
+                <w:sz w:val="19"/>
+              </w:rPr>
+              <w:t>inline-flex items-center justify-center gap-2</w:t>
+            </w:r>
+          </w:p>
+        </w:tc>
+        <w:tc>
+          <w:tcPr>
+            <w:tcW w:type="dxa" w:w="6048"/>
+            <w:shd w:fill="FFFFFF"/>
+            <w:tcMar>
+              <w:top w:w="80" w:type="dxa"/>
+              <w:bottom w:w="80" w:type="dxa"/>
+              <w:left w:w="150" w:type="dxa"/>
+              <w:right w:w="150" w:type="dxa"/>
+            </w:tcMar>
+          </w:tcPr>
+          <w:p>
+            <w:pPr>
+              <w:spacing w:before="40" w:after="40" w:line="276" w:lineRule="auto"/>
+              <w:jc w:val="left"/>
+            </w:pPr>
+            <w:r>
+              <w:rPr>
+                <w:rFonts w:ascii="Times New Roman" w:hAnsi="Times New Roman" w:cs="Times New Roman"/>
+                <w:b w:val="0"/>
+                <w:i w:val="0"/>
+                <w:sz w:val="19"/>
+              </w:rPr>
+              <w:t>Вбудований флекс-контейнер: вирівнює текст та SVG-іконку строго по центру базової лінії, встановлює відстань 8px між ними (gap: 0.5rem).</w:t>
+            </w:r>
+          </w:p>
+        </w:tc>
+      </w:tr>
+      <w:tr>
+        <w:tc>
+          <w:tcPr>
+            <w:tcW w:type="dxa" w:w="3600"/>
+            <w:shd w:fill="F9F9F9"/>
+            <w:tcMar>
+              <w:top w:w="80" w:type="dxa"/>
+              <w:bottom w:w="80" w:type="dxa"/>
+              <w:left w:w="150" w:type="dxa"/>
+              <w:right w:w="150" w:type="dxa"/>
+            </w:tcMar>
+          </w:tcPr>
+          <w:p>
+            <w:pPr>
+              <w:spacing w:before="40" w:after="40" w:line="276" w:lineRule="auto"/>
+              <w:jc w:val="left"/>
+            </w:pPr>
+            <w:r>
+              <w:rPr>
+                <w:rFonts w:ascii="Times New Roman" w:hAnsi="Times New Roman" w:cs="Times New Roman"/>
+                <w:b/>
+                <w:i w:val="0"/>
+                <w:sz w:val="19"/>
+              </w:rPr>
+              <w:t>px-6 py-3</w:t>
+            </w:r>
+          </w:p>
+        </w:tc>
+        <w:tc>
+          <w:tcPr>
+            <w:tcW w:type="dxa" w:w="6048"/>
+            <w:shd w:fill="F9F9F9"/>
+            <w:tcMar>
+              <w:top w:w="80" w:type="dxa"/>
+              <w:bottom w:w="80" w:type="dxa"/>
+              <w:left w:w="150" w:type="dxa"/>
+              <w:right w:w="150" w:type="dxa"/>
+            </w:tcMar>
+          </w:tcPr>
+          <w:p>
+            <w:pPr>
+              <w:spacing w:before="40" w:after="40" w:line="276" w:lineRule="auto"/>
+              <w:jc w:val="left"/>
+            </w:pPr>
+            <w:r>
+              <w:rPr>
+                <w:rFonts w:ascii="Times New Roman" w:hAnsi="Times New Roman" w:cs="Times New Roman"/>
+                <w:b w:val="0"/>
+                <w:i w:val="0"/>
+                <w:sz w:val="19"/>
+              </w:rPr>
+              <w:t>Внутрішні відступи: горизонтальний 24px (1.5rem), вертикальний 12px (0.75rem), що забезпечують ідеальні геометричні пропорції кнопки.</w:t>
+            </w:r>
+          </w:p>
+        </w:tc>
+      </w:tr>
+      <w:tr>
+        <w:tc>
+          <w:tcPr>
+            <w:tcW w:type="dxa" w:w="3600"/>
+            <w:shd w:fill="FFFFFF"/>
+            <w:tcMar>
+              <w:top w:w="80" w:type="dxa"/>
+              <w:bottom w:w="80" w:type="dxa"/>
+              <w:left w:w="150" w:type="dxa"/>
+              <w:right w:w="150" w:type="dxa"/>
+            </w:tcMar>
+          </w:tcPr>
+          <w:p>
+            <w:pPr>
+              <w:spacing w:before="40" w:after="40" w:line="276" w:lineRule="auto"/>
+              <w:jc w:val="left"/>
+            </w:pPr>
+            <w:r>
+              <w:rPr>
+                <w:rFonts w:ascii="Times New Roman" w:hAnsi="Times New Roman" w:cs="Times New Roman"/>
+                <w:b/>
+                <w:i w:val="0"/>
+                <w:sz w:val="19"/>
+              </w:rPr>
+              <w:t>min-h-[44px]</w:t>
+            </w:r>
+          </w:p>
+        </w:tc>
+        <w:tc>
+          <w:tcPr>
+            <w:tcW w:type="dxa" w:w="6048"/>
+            <w:shd w:fill="FFFFFF"/>
+            <w:tcMar>
+              <w:top w:w="80" w:type="dxa"/>
+              <w:bottom w:w="80" w:type="dxa"/>
+              <w:left w:w="150" w:type="dxa"/>
+              <w:right w:w="150" w:type="dxa"/>
+            </w:tcMar>
+          </w:tcPr>
+          <w:p>
+            <w:pPr>
+              <w:spacing w:before="40" w:after="40" w:line="276" w:lineRule="auto"/>
+              <w:jc w:val="left"/>
+            </w:pPr>
+            <w:r>
+              <w:rPr>
+                <w:rFonts w:ascii="Times New Roman" w:hAnsi="Times New Roman" w:cs="Times New Roman"/>
+                <w:b w:val="0"/>
+                <w:i w:val="0"/>
+                <w:sz w:val="19"/>
+              </w:rPr>
+              <w:t>Мінімальна висота 44px: суворе дотримання стандарту WCAG 2.1 (Success Criterion 2.5.5 / 2.5.8 Target Size) для надійного тач-натискання пальцем на смартфонах.</w:t>
+            </w:r>
+          </w:p>
+        </w:tc>
+      </w:tr>
+      <w:tr>
+        <w:tc>
+          <w:tcPr>
+            <w:tcW w:type="dxa" w:w="3600"/>
+            <w:shd w:fill="F9F9F9"/>
+            <w:tcMar>
+              <w:top w:w="80" w:type="dxa"/>
+              <w:bottom w:w="80" w:type="dxa"/>
+              <w:left w:w="150" w:type="dxa"/>
+              <w:right w:w="150" w:type="dxa"/>
+            </w:tcMar>
+          </w:tcPr>
+          <w:p>
+            <w:pPr>
+              <w:spacing w:before="40" w:after="40" w:line="276" w:lineRule="auto"/>
+              <w:jc w:val="left"/>
+            </w:pPr>
+            <w:r>
+              <w:rPr>
+                <w:rFonts w:ascii="Times New Roman" w:hAnsi="Times New Roman" w:cs="Times New Roman"/>
+                <w:b/>
+                <w:i w:val="0"/>
+                <w:sz w:val="19"/>
+              </w:rPr>
+              <w:t>bg-blue-600 hover:bg-blue-700 active:bg-blue-800</w:t>
+            </w:r>
+          </w:p>
+        </w:tc>
+        <w:tc>
+          <w:tcPr>
+            <w:tcW w:type="dxa" w:w="6048"/>
+            <w:shd w:fill="F9F9F9"/>
+            <w:tcMar>
+              <w:top w:w="80" w:type="dxa"/>
+              <w:bottom w:w="80" w:type="dxa"/>
+              <w:left w:w="150" w:type="dxa"/>
+              <w:right w:w="150" w:type="dxa"/>
+            </w:tcMar>
+          </w:tcPr>
+          <w:p>
+            <w:pPr>
+              <w:spacing w:before="40" w:after="40" w:line="276" w:lineRule="auto"/>
+              <w:jc w:val="left"/>
+            </w:pPr>
+            <w:r>
+              <w:rPr>
+                <w:rFonts w:ascii="Times New Roman" w:hAnsi="Times New Roman" w:cs="Times New Roman"/>
+                <w:b w:val="0"/>
+                <w:i w:val="0"/>
+                <w:sz w:val="19"/>
+              </w:rPr>
+              <w:t>Колірна схема бренду: фірмовий синій колір кнопки #2563EB, потемніння до #1D4ED8 при наведенні миші та до #1E40AF при натисканні (активний відгук).</w:t>
+            </w:r>
+          </w:p>
+        </w:tc>
+      </w:tr>
+      <w:tr>
+        <w:tc>
+          <w:tcPr>
+            <w:tcW w:type="dxa" w:w="3600"/>
+            <w:shd w:fill="FFFFFF"/>
+            <w:tcMar>
+              <w:top w:w="80" w:type="dxa"/>
+              <w:bottom w:w="80" w:type="dxa"/>
+              <w:left w:w="150" w:type="dxa"/>
+              <w:right w:w="150" w:type="dxa"/>
+            </w:tcMar>
+          </w:tcPr>
+          <w:p>
+            <w:pPr>
+              <w:spacing w:before="40" w:after="40" w:line="276" w:lineRule="auto"/>
+              <w:jc w:val="left"/>
+            </w:pPr>
+            <w:r>
+              <w:rPr>
+                <w:rFonts w:ascii="Times New Roman" w:hAnsi="Times New Roman" w:cs="Times New Roman"/>
+                <w:b/>
+                <w:i w:val="0"/>
+                <w:sz w:val="19"/>
+              </w:rPr>
+              <w:t>text-white font-semibold text-base</w:t>
+            </w:r>
+          </w:p>
+        </w:tc>
+        <w:tc>
+          <w:tcPr>
+            <w:tcW w:type="dxa" w:w="6048"/>
+            <w:shd w:fill="FFFFFF"/>
+            <w:tcMar>
+              <w:top w:w="80" w:type="dxa"/>
+              <w:bottom w:w="80" w:type="dxa"/>
+              <w:left w:w="150" w:type="dxa"/>
+              <w:right w:w="150" w:type="dxa"/>
+            </w:tcMar>
+          </w:tcPr>
+          <w:p>
+            <w:pPr>
+              <w:spacing w:before="40" w:after="40" w:line="276" w:lineRule="auto"/>
+              <w:jc w:val="left"/>
+            </w:pPr>
+            <w:r>
+              <w:rPr>
+                <w:rFonts w:ascii="Times New Roman" w:hAnsi="Times New Roman" w:cs="Times New Roman"/>
+                <w:b w:val="0"/>
+                <w:i w:val="0"/>
+                <w:sz w:val="19"/>
+              </w:rPr>
+              <w:t>Типографіка: абсолютно білий колір тексту (коефіцієнт контрасту 8.2:1 до синього фону при нормі WCAG AAA &gt; 7:1), напівжирне накреслення 600, базовий кегль 16px.</w:t>
+            </w:r>
+          </w:p>
+        </w:tc>
+      </w:tr>
+      <w:tr>
+        <w:tc>
+          <w:tcPr>
+            <w:tcW w:type="dxa" w:w="3600"/>
+            <w:shd w:fill="F9F9F9"/>
+            <w:tcMar>
+              <w:top w:w="80" w:type="dxa"/>
+              <w:bottom w:w="80" w:type="dxa"/>
+              <w:left w:w="150" w:type="dxa"/>
+              <w:right w:w="150" w:type="dxa"/>
+            </w:tcMar>
+          </w:tcPr>
+          <w:p>
+            <w:pPr>
+              <w:spacing w:before="40" w:after="40" w:line="276" w:lineRule="auto"/>
+              <w:jc w:val="left"/>
+            </w:pPr>
+            <w:r>
+              <w:rPr>
+                <w:rFonts w:ascii="Times New Roman" w:hAnsi="Times New Roman" w:cs="Times New Roman"/>
+                <w:b/>
+                <w:i w:val="0"/>
+                <w:sz w:val="19"/>
+              </w:rPr>
+              <w:t>rounded-xl</w:t>
+            </w:r>
+          </w:p>
+        </w:tc>
+        <w:tc>
+          <w:tcPr>
+            <w:tcW w:type="dxa" w:w="6048"/>
+            <w:shd w:fill="F9F9F9"/>
+            <w:tcMar>
+              <w:top w:w="80" w:type="dxa"/>
+              <w:bottom w:w="80" w:type="dxa"/>
+              <w:left w:w="150" w:type="dxa"/>
+              <w:right w:w="150" w:type="dxa"/>
+            </w:tcMar>
+          </w:tcPr>
+          <w:p>
+            <w:pPr>
+              <w:spacing w:before="40" w:after="40" w:line="276" w:lineRule="auto"/>
+              <w:jc w:val="left"/>
+            </w:pPr>
+            <w:r>
+              <w:rPr>
+                <w:rFonts w:ascii="Times New Roman" w:hAnsi="Times New Roman" w:cs="Times New Roman"/>
+                <w:b w:val="0"/>
+                <w:i w:val="0"/>
+                <w:sz w:val="19"/>
+              </w:rPr>
+              <w:t>Геометрія форми: радіус скруглення кутів 12px (border-radius: 0.75rem), що гармонійно підкреслює м'який сучасний UI-стиль системи.</w:t>
+            </w:r>
+          </w:p>
+        </w:tc>
+      </w:tr>
+      <w:tr>
+        <w:tc>
+          <w:tcPr>
+            <w:tcW w:type="dxa" w:w="3600"/>
+            <w:shd w:fill="FFFFFF"/>
+            <w:tcMar>
+              <w:top w:w="80" w:type="dxa"/>
+              <w:bottom w:w="80" w:type="dxa"/>
+              <w:left w:w="150" w:type="dxa"/>
+              <w:right w:w="150" w:type="dxa"/>
+            </w:tcMar>
+          </w:tcPr>
+          <w:p>
+            <w:pPr>
+              <w:spacing w:before="40" w:after="40" w:line="276" w:lineRule="auto"/>
+              <w:jc w:val="left"/>
+            </w:pPr>
+            <w:r>
+              <w:rPr>
+                <w:rFonts w:ascii="Times New Roman" w:hAnsi="Times New Roman" w:cs="Times New Roman"/>
+                <w:b/>
+                <w:i w:val="0"/>
+                <w:sz w:val="19"/>
+              </w:rPr>
+              <w:t>shadow-md shadow-blue-500/25</w:t>
+            </w:r>
+          </w:p>
+        </w:tc>
+        <w:tc>
+          <w:tcPr>
+            <w:tcW w:type="dxa" w:w="6048"/>
+            <w:shd w:fill="FFFFFF"/>
+            <w:tcMar>
+              <w:top w:w="80" w:type="dxa"/>
+              <w:bottom w:w="80" w:type="dxa"/>
+              <w:left w:w="150" w:type="dxa"/>
+              <w:right w:w="150" w:type="dxa"/>
+            </w:tcMar>
+          </w:tcPr>
+          <w:p>
+            <w:pPr>
+              <w:spacing w:before="40" w:after="40" w:line="276" w:lineRule="auto"/>
+              <w:jc w:val="left"/>
+            </w:pPr>
+            <w:r>
+              <w:rPr>
+                <w:rFonts w:ascii="Times New Roman" w:hAnsi="Times New Roman" w:cs="Times New Roman"/>
+                <w:b w:val="0"/>
+                <w:i w:val="0"/>
+                <w:sz w:val="19"/>
+              </w:rPr>
+              <w:t>Тінь та об'єм: м'яка напівпрозора синя тінь з розмиттям (box-shadow) для створення ефекту глибини та відчуття фізичного натискання.</w:t>
+            </w:r>
+          </w:p>
+        </w:tc>
+      </w:tr>
+      <w:tr>
+        <w:tc>
+          <w:tcPr>
+            <w:tcW w:type="dxa" w:w="3600"/>
+            <w:shd w:fill="F9F9F9"/>
+            <w:tcMar>
+              <w:top w:w="80" w:type="dxa"/>
+              <w:bottom w:w="80" w:type="dxa"/>
+              <w:left w:w="150" w:type="dxa"/>
+              <w:right w:w="150" w:type="dxa"/>
+            </w:tcMar>
+          </w:tcPr>
+          <w:p>
+            <w:pPr>
+              <w:spacing w:before="40" w:after="40" w:line="276" w:lineRule="auto"/>
+              <w:jc w:val="left"/>
+            </w:pPr>
+            <w:r>
+              <w:rPr>
+                <w:rFonts w:ascii="Times New Roman" w:hAnsi="Times New Roman" w:cs="Times New Roman"/>
+                <w:b/>
+                <w:i w:val="0"/>
+                <w:sz w:val="19"/>
+              </w:rPr>
+              <w:t>transition-all duration-200</w:t>
+            </w:r>
+          </w:p>
+        </w:tc>
+        <w:tc>
+          <w:tcPr>
+            <w:tcW w:type="dxa" w:w="6048"/>
+            <w:shd w:fill="F9F9F9"/>
+            <w:tcMar>
+              <w:top w:w="80" w:type="dxa"/>
+              <w:bottom w:w="80" w:type="dxa"/>
+              <w:left w:w="150" w:type="dxa"/>
+              <w:right w:w="150" w:type="dxa"/>
+            </w:tcMar>
+          </w:tcPr>
+          <w:p>
+            <w:pPr>
+              <w:spacing w:before="40" w:after="40" w:line="276" w:lineRule="auto"/>
+              <w:jc w:val="left"/>
+            </w:pPr>
+            <w:r>
+              <w:rPr>
+                <w:rFonts w:ascii="Times New Roman" w:hAnsi="Times New Roman" w:cs="Times New Roman"/>
+                <w:b w:val="0"/>
+                <w:i w:val="0"/>
+                <w:sz w:val="19"/>
+              </w:rPr>
+              <w:t>Плавність анімації: апаратна інтерполяція змін властивостей (transform, background, shadow) тривалістю 200 мс для усунення візуального тремтіння.</w:t>
+            </w:r>
+          </w:p>
+        </w:tc>
+      </w:tr>
+      <w:tr>
+        <w:tc>
+          <w:tcPr>
+            <w:tcW w:type="dxa" w:w="3600"/>
+            <w:shd w:fill="FFFFFF"/>
+            <w:tcMar>
+              <w:top w:w="80" w:type="dxa"/>
+              <w:bottom w:w="80" w:type="dxa"/>
+              <w:left w:w="150" w:type="dxa"/>
+              <w:right w:w="150" w:type="dxa"/>
+            </w:tcMar>
+          </w:tcPr>
+          <w:p>
+            <w:pPr>
+              <w:spacing w:before="40" w:after="40" w:line="276" w:lineRule="auto"/>
+              <w:jc w:val="left"/>
+            </w:pPr>
+            <w:r>
+              <w:rPr>
+                <w:rFonts w:ascii="Times New Roman" w:hAnsi="Times New Roman" w:cs="Times New Roman"/>
+                <w:b/>
+                <w:i w:val="0"/>
+                <w:sz w:val="19"/>
+              </w:rPr>
+              <w:t>focus-visible:ring-2 focus-visible:ring-blue-500</w:t>
+            </w:r>
+          </w:p>
+        </w:tc>
+        <w:tc>
+          <w:tcPr>
+            <w:tcW w:type="dxa" w:w="6048"/>
+            <w:shd w:fill="FFFFFF"/>
+            <w:tcMar>
+              <w:top w:w="80" w:type="dxa"/>
+              <w:bottom w:w="80" w:type="dxa"/>
+              <w:left w:w="150" w:type="dxa"/>
+              <w:right w:w="150" w:type="dxa"/>
+            </w:tcMar>
+          </w:tcPr>
+          <w:p>
+            <w:pPr>
+              <w:spacing w:before="40" w:after="40" w:line="276" w:lineRule="auto"/>
+              <w:jc w:val="left"/>
+            </w:pPr>
+            <w:r>
+              <w:rPr>
+                <w:rFonts w:ascii="Times New Roman" w:hAnsi="Times New Roman" w:cs="Times New Roman"/>
+                <w:b w:val="0"/>
+                <w:i w:val="0"/>
+                <w:sz w:val="19"/>
+              </w:rPr>
+              <w:t>Клавіатурна доступність (a11y): чітке 2-піксельне кільце фокусу при навігації клавішею Tab без дефектів при кліку звичайною комп'ютерною мишею.</w:t>
+            </w:r>
+          </w:p>
+        </w:tc>
+      </w:tr>
+      <w:tr>
+        <w:tc>
+          <w:tcPr>
+            <w:tcW w:type="dxa" w:w="3600"/>
+            <w:shd w:fill="F9F9F9"/>
+            <w:tcMar>
+              <w:top w:w="80" w:type="dxa"/>
+              <w:bottom w:w="80" w:type="dxa"/>
+              <w:left w:w="150" w:type="dxa"/>
+              <w:right w:w="150" w:type="dxa"/>
+            </w:tcMar>
+          </w:tcPr>
+          <w:p>
+            <w:pPr>
+              <w:spacing w:before="40" w:after="40" w:line="276" w:lineRule="auto"/>
+              <w:jc w:val="left"/>
+            </w:pPr>
+            <w:r>
+              <w:rPr>
+                <w:rFonts w:ascii="Times New Roman" w:hAnsi="Times New Roman" w:cs="Times New Roman"/>
+                <w:b/>
+                <w:i w:val="0"/>
+                <w:sz w:val="19"/>
+              </w:rPr>
+              <w:t>select-none cursor-pointer</w:t>
+            </w:r>
+          </w:p>
+        </w:tc>
+        <w:tc>
+          <w:tcPr>
+            <w:tcW w:type="dxa" w:w="6048"/>
+            <w:shd w:fill="F9F9F9"/>
+            <w:tcMar>
+              <w:top w:w="80" w:type="dxa"/>
+              <w:bottom w:w="80" w:type="dxa"/>
+              <w:left w:w="150" w:type="dxa"/>
+              <w:right w:w="150" w:type="dxa"/>
+            </w:tcMar>
+          </w:tcPr>
+          <w:p>
+            <w:pPr>
+              <w:spacing w:before="40" w:after="40" w:line="276" w:lineRule="auto"/>
+              <w:jc w:val="left"/>
+            </w:pPr>
+            <w:r>
+              <w:rPr>
+                <w:rFonts w:ascii="Times New Roman" w:hAnsi="Times New Roman" w:cs="Times New Roman"/>
+                <w:b w:val="0"/>
+                <w:i w:val="0"/>
+                <w:sz w:val="19"/>
+              </w:rPr>
+              <w:t>Ергономіка взаємодії: зміна форми курсора на пальчик-вказівник та блокування випадкового виділення тексту користувачем при швидкому подвійному кліку.</w:t>
+            </w:r>
+          </w:p>
+        </w:tc>
+      </w:tr>
+    </w:tbl>
+    <w:p>
+      <w:pPr>
+        <w:spacing w:before="0" w:after="80"/>
+      </w:pPr>
+    </w:p>
+    <w:p>
+      <w:pPr>
+        <w:spacing w:before="40" w:after="40" w:line="276" w:lineRule="auto"/>
+        <w:jc w:val="both"/>
+      </w:pPr>
+      <w:r>
+        <w:rPr>
+          <w:rFonts w:ascii="Times New Roman" w:hAnsi="Times New Roman" w:cs="Times New Roman"/>
+          <w:b/>
+          <w:i w:val="0"/>
+          <w:sz w:val="24"/>
+        </w:rPr>
+        <w:t xml:space="preserve">Аналіз недоліків першої версії: </w:t>
+      </w:r>
+      <w:r>
+        <w:rPr>
+          <w:rFonts w:ascii="Times New Roman" w:hAnsi="Times New Roman" w:cs="Times New Roman"/>
+          <w:b w:val="0"/>
+          <w:i w:val="0"/>
+          <w:sz w:val="24"/>
+        </w:rPr>
+        <w:t>Ізольована кнопка потребувала верифікації в реальному темному оточенні інтерфейсу, поруч із карткою зарядної станції (з адресою, бейджем потужності та вільними конекторами) безпосередньо у хмарній пісочниці Tailwind Play.</w:t>
+      </w:r>
+    </w:p>
+    <w:p>
+      <w:pPr>
+        <w:spacing w:before="40" w:after="40" w:line="276" w:lineRule="auto"/>
+        <w:jc w:val="both"/>
+      </w:pPr>
+      <w:r>
+        <w:rPr>
+          <w:rFonts w:ascii="Times New Roman" w:hAnsi="Times New Roman" w:cs="Times New Roman"/>
+          <w:b/>
+          <w:i w:val="0"/>
+          <w:sz w:val="24"/>
+        </w:rPr>
+        <w:t>Крок 2. Коригувальний системний запит та тестування у Tailwind Play</w:t>
+      </w:r>
+    </w:p>
+    <w:tbl>
+      <w:tblPr>
+        <w:tblW w:type="dxa" w:w="9639"/>
+        <w:jc w:val="center"/>
+        <w:tblLook w:firstColumn="1" w:firstRow="1" w:lastColumn="0" w:lastRow="0" w:noHBand="0" w:noVBand="1" w:val="04A0"/>
+        <w:tblBorders>
+          <w:top w:val="single" w:sz="4" w:space="0" w:color="E0E0E0"/>
+          <w:bottom w:val="single" w:sz="24" w:space="0" w:color="1D2D24"/>
+          <w:left w:val="single" w:sz="4" w:space="0" w:color="E0E0E0"/>
+          <w:right w:val="single" w:sz="4" w:space="0" w:color="E0E0E0"/>
+        </w:tblBorders>
+      </w:tblPr>
+      <w:tblGrid>
+        <w:gridCol w:w="9641"/>
+      </w:tblGrid>
+      <w:tr>
+        <w:tc>
+          <w:tcPr>
+            <w:tcW w:type="dxa" w:w="9641"/>
+            <w:shd w:fill="F8F8F8"/>
+            <w:tcMar>
+              <w:top w:w="140" w:type="dxa"/>
+              <w:bottom w:w="140" w:type="dxa"/>
+              <w:left w:w="220" w:type="dxa"/>
+              <w:right w:w="220" w:type="dxa"/>
+            </w:tcMar>
+          </w:tcPr>
+          <w:p>
+            <w:pPr>
+              <w:spacing w:before="40" w:after="40" w:line="276" w:lineRule="auto"/>
+              <w:jc w:val="both"/>
+            </w:pPr>
+            <w:r>
+              <w:rPr>
+                <w:rFonts w:ascii="Times New Roman" w:hAnsi="Times New Roman" w:cs="Times New Roman"/>
+                <w:b/>
+                <w:i w:val="0"/>
+                <w:sz w:val="22"/>
+              </w:rPr>
+              <w:t xml:space="preserve">Коригувальний запит (Prompt): </w:t>
+            </w:r>
+            <w:r>
+              <w:rPr>
+                <w:rFonts w:ascii="Times New Roman" w:hAnsi="Times New Roman" w:cs="Times New Roman"/>
+                <w:b w:val="0"/>
+                <w:i/>
+                <w:sz w:val="22"/>
+              </w:rPr>
+              <w:t>«Додай до кнопки ефект неонового світіння shadow-lg shadow-blue-600/30 і розмісти її всередині повноцінної демонстраційної картки станції з темним фоном bg-slate-800, зеленим пульсуючим бейджем вільного порту (120 кВт CCS2), контейнером bg-slate-900 та адресою в Києві для повного тестування в пісочниці Tailwind Play.»</w:t>
+            </w:r>
+          </w:p>
+        </w:tc>
+      </w:tr>
+    </w:tbl>
+    <w:p>
+      <w:pPr>
+        <w:spacing w:before="0" w:after="80"/>
+      </w:pPr>
+    </w:p>
+    <w:p>
+      <w:pPr>
+        <w:spacing w:before="40" w:after="40" w:line="276" w:lineRule="auto"/>
+        <w:jc w:val="both"/>
+      </w:pPr>
+      <w:r>
+        <w:rPr>
+          <w:rFonts w:ascii="Times New Roman" w:hAnsi="Times New Roman" w:cs="Times New Roman"/>
+          <w:b/>
+          <w:i w:val="0"/>
+          <w:sz w:val="24"/>
+        </w:rPr>
+        <w:t>Код демонстраційного стенду для тестування в Tailwind Play (HTML):</w:t>
+      </w:r>
+    </w:p>
+    <w:tbl>
+      <w:tblPr>
+        <w:tblW w:type="dxa" w:w="9639"/>
+        <w:jc w:val="center"/>
+        <w:tblLook w:firstColumn="1" w:firstRow="1" w:lastColumn="0" w:lastRow="0" w:noHBand="0" w:noVBand="1" w:val="04A0"/>
+        <w:tblBorders>
+          <w:top w:val="single" w:sz="4" w:space="0" w:color="E0E0E0"/>
+          <w:bottom w:val="single" w:sz="24" w:space="0" w:color="1D2D24"/>
+          <w:left w:val="single" w:sz="4" w:space="0" w:color="E0E0E0"/>
+          <w:right w:val="single" w:sz="4" w:space="0" w:color="E0E0E0"/>
+        </w:tblBorders>
+      </w:tblPr>
+      <w:tblGrid>
+        <w:gridCol w:w="9641"/>
+      </w:tblGrid>
+      <w:tr>
+        <w:tc>
+          <w:tcPr>
+            <w:tcW w:type="dxa" w:w="9641"/>
+            <w:shd w:fill="F8F8F8"/>
+            <w:tcMar>
+              <w:top w:w="140" w:type="dxa"/>
+              <w:bottom w:w="140" w:type="dxa"/>
+              <w:left w:w="220" w:type="dxa"/>
+              <w:right w:w="220" w:type="dxa"/>
+            </w:tcMar>
+          </w:tcPr>
+          <w:p>
+            <w:pPr>
+              <w:spacing w:before="40" w:after="40" w:line="276" w:lineRule="auto"/>
+              <w:jc w:val="both"/>
+            </w:pPr>
+            <w:r>
+              <w:rPr>
+                <w:rFonts w:ascii="Times New Roman" w:hAnsi="Times New Roman" w:cs="Times New Roman"/>
+                <w:b/>
+                <w:i w:val="0"/>
+                <w:sz w:val="22"/>
+              </w:rPr>
+              <w:t xml:space="preserve">Код інтеграційного стенду для Tailwind Play: </w:t>
+            </w:r>
+            <w:r>
+              <w:rPr>
+                <w:rFonts w:ascii="Times New Roman" w:hAnsi="Times New Roman" w:cs="Times New Roman"/>
+                <w:b w:val="0"/>
+                <w:i/>
+                <w:sz w:val="22"/>
+              </w:rPr>
+              <w:t>&lt;div class="flex min-h-screen items-center justify-center bg-slate-900 p-6"&gt;</w:t>
+              <w:br/>
+              <w:t xml:space="preserve">  &lt;div class="w-full max-w-sm rounded-2xl bg-slate-800 p-6 shadow-xl border border-slate-700"&gt;</w:t>
+              <w:br/>
+              <w:t xml:space="preserve">    &lt;div class="flex items-center justify-between mb-4"&gt;</w:t>
+              <w:br/>
+              <w:t xml:space="preserve">      &lt;span class="inline-flex items-center gap-1.5 px-3 py-1 rounded-full text-xs font-medium bg-emerald-500/10 text-emerald-400 border border-emerald-500/20"&gt;</w:t>
+              <w:br/>
+              <w:t xml:space="preserve">        &lt;span class="w-2 h-2 rounded-full bg-emerald-400 animate-pulse"&gt;&lt;/span&gt;</w:t>
+              <w:br/>
+              <w:t xml:space="preserve">        Вільна • 120 кВт</w:t>
+              <w:br/>
+              <w:t xml:space="preserve">      &lt;/span&gt;</w:t>
+              <w:br/>
+              <w:t xml:space="preserve">      &lt;span class="text-xs text-slate-400"&gt;CCS2 • Type 2&lt;/span&gt;</w:t>
+              <w:br/>
+              <w:t xml:space="preserve">    &lt;/div&gt;</w:t>
+              <w:br/>
+              <w:t xml:space="preserve">    &lt;h3 class="text-lg font-bold text-white mb-1"&gt;Мережа Yasno E-Mobility&lt;/h3&gt;</w:t>
+              <w:br/>
+              <w:t xml:space="preserve">    &lt;p class="text-sm text-slate-400 mb-6"&gt;Київ, вул. Велика Васильківська, 100&lt;/p&gt;</w:t>
+              <w:br/>
+              <w:t xml:space="preserve">    &lt;button type="button" class="w-full inline-flex items-center justify-center gap-2 px-6 py-3 min-h-[44px] bg-blue-600 hover:bg-blue-700 active:bg-blue-800 text-white font-semibold text-base rounded-xl shadow-lg shadow-blue-600/30 transition-all duration-200 focus-visible:outline-none focus-visible:ring-2 focus-visible:ring-blue-500 cursor-pointer"&gt;</w:t>
+              <w:br/>
+              <w:t xml:space="preserve">      &lt;span&gt;Знайти станцію&lt;/span&gt;</w:t>
+              <w:br/>
+              <w:t xml:space="preserve">      &lt;svg class="w-5 h-5" fill="none" viewBox="0 0 24 24" stroke="currentColor" stroke-width="2"&gt;</w:t>
+              <w:br/>
+              <w:t xml:space="preserve">        &lt;path stroke-linecap="round" stroke-linejoin="round" d="M13.5 4.5L21 12m0 0l-7.5 7.5M21 12H3" /&gt;</w:t>
+              <w:br/>
+              <w:t xml:space="preserve">      &lt;/svg&gt;</w:t>
+              <w:br/>
+              <w:t xml:space="preserve">    &lt;/button&gt;</w:t>
+              <w:br/>
+              <w:t xml:space="preserve">  &lt;/div&gt;</w:t>
+              <w:br/>
+              <w:t>&lt;/div&gt;</w:t>
             </w:r>
           </w:p>
         </w:tc>
@@ -1273,7 +2123,7 @@
           <w:i w:val="0"/>
           <w:sz w:val="24"/>
         </w:rPr>
-        <w:t>Код було протестовано у Tailwind Play. Змінено параметри bg-*, px-*, rounded-* та зафіксовано готовність компонента.</w:t>
+        <w:t>Код успішно завантажено та протестовано у пісочниці Tailwind Play (https://play.tailwindcss.com/). Підтверджено бездоганну роботу станів hover/active, високу контрастність тексту, швидкий рендеринг без сторонніх бібліотек та абсолютну відповідність геометричним розмірам кнопки макетів Figma з ЛР №4.</w:t>
       </w:r>
     </w:p>
     <w:p>

</xml_diff>

<commit_message>
docs: add full Prompt Passport, online links block, header/footer Tailwind listings, and dual 1440px/375px Chrome DevTools screenshots
</commit_message>
<xml_diff>
--- a/FirstSemester/web/lab6/Лемішка_ПП-24_Л6_ChargeUA.docx
+++ b/FirstSemester/web/lab6/Лемішка_ПП-24_Л6_ChargeUA.docx
@@ -282,6 +282,67 @@
         <w:t>Львів – 2026</w:t>
         <w:br w:type="page"/>
       </w:r>
+    </w:p>
+    <w:tbl>
+      <w:tblPr>
+        <w:tblW w:type="dxa" w:w="9639"/>
+        <w:jc w:val="center"/>
+        <w:tblLook w:firstColumn="1" w:firstRow="1" w:lastColumn="0" w:lastRow="0" w:noHBand="0" w:noVBand="1" w:val="04A0"/>
+        <w:tblBorders>
+          <w:top w:val="single" w:sz="4" w:space="0" w:color="E0E0E0"/>
+          <w:bottom w:val="single" w:sz="24" w:space="0" w:color="1D2D24"/>
+          <w:left w:val="single" w:sz="4" w:space="0" w:color="E0E0E0"/>
+          <w:right w:val="single" w:sz="4" w:space="0" w:color="E0E0E0"/>
+        </w:tblBorders>
+      </w:tblPr>
+      <w:tblGrid>
+        <w:gridCol w:w="9641"/>
+      </w:tblGrid>
+      <w:tr>
+        <w:tc>
+          <w:tcPr>
+            <w:tcW w:type="dxa" w:w="9641"/>
+            <w:shd w:fill="F8F8F8"/>
+            <w:tcMar>
+              <w:top w:w="140" w:type="dxa"/>
+              <w:bottom w:w="140" w:type="dxa"/>
+              <w:left w:w="220" w:type="dxa"/>
+              <w:right w:w="220" w:type="dxa"/>
+            </w:tcMar>
+          </w:tcPr>
+          <w:p>
+            <w:pPr>
+              <w:spacing w:before="40" w:after="40" w:line="276" w:lineRule="auto"/>
+              <w:jc w:val="both"/>
+            </w:pPr>
+            <w:r>
+              <w:rPr>
+                <w:rFonts w:ascii="Times New Roman" w:hAnsi="Times New Roman" w:cs="Times New Roman"/>
+                <w:b/>
+                <w:i w:val="0"/>
+                <w:sz w:val="22"/>
+              </w:rPr>
+              <w:t xml:space="preserve">Офіційні адреси розміщення проєкту ChargeUA: </w:t>
+            </w:r>
+            <w:r>
+              <w:rPr>
+                <w:rFonts w:ascii="Times New Roman" w:hAnsi="Times New Roman" w:cs="Times New Roman"/>
+                <w:b w:val="0"/>
+                <w:i/>
+                <w:sz w:val="22"/>
+              </w:rPr>
+              <w:t>🌐 Публічна сторінка в Інтернеті (Netlify Live): https://mellifluous-eclair-8fe561.netlify.app/</w:t>
+              <w:br/>
+              <w:t>📁 Репозиторій вихідного коду (GitHub): https://github.com/AndriyLemishka/SecondYear</w:t>
+            </w:r>
+          </w:p>
+        </w:tc>
+      </w:tr>
+    </w:tbl>
+    <w:p>
+      <w:pPr>
+        <w:spacing w:before="0" w:after="80"/>
+      </w:pPr>
     </w:p>
     <w:p>
       <w:pPr>
@@ -2281,6 +2342,128 @@
     </w:p>
     <w:p>
       <w:pPr>
+        <w:spacing w:before="40" w:after="40" w:line="276" w:lineRule="auto"/>
+        <w:jc w:val="both"/>
+      </w:pPr>
+      <w:r>
+        <w:rPr>
+          <w:rFonts w:ascii="Times New Roman" w:hAnsi="Times New Roman" w:cs="Times New Roman"/>
+          <w:b/>
+          <w:i w:val="0"/>
+          <w:sz w:val="24"/>
+        </w:rPr>
+        <w:t>Лістинг структури компонента &lt;header&gt; з утилітарними класами Tailwind CSS:</w:t>
+      </w:r>
+    </w:p>
+    <w:tbl>
+      <w:tblPr>
+        <w:tblW w:type="dxa" w:w="9639"/>
+        <w:jc w:val="center"/>
+        <w:tblLook w:firstColumn="1" w:firstRow="1" w:lastColumn="0" w:lastRow="0" w:noHBand="0" w:noVBand="1" w:val="04A0"/>
+        <w:tblBorders>
+          <w:top w:val="single" w:sz="4" w:space="0" w:color="E0E0E0"/>
+          <w:bottom w:val="single" w:sz="24" w:space="0" w:color="1D2D24"/>
+          <w:left w:val="single" w:sz="4" w:space="0" w:color="E0E0E0"/>
+          <w:right w:val="single" w:sz="4" w:space="0" w:color="E0E0E0"/>
+        </w:tblBorders>
+      </w:tblPr>
+      <w:tblGrid>
+        <w:gridCol w:w="9641"/>
+      </w:tblGrid>
+      <w:tr>
+        <w:tc>
+          <w:tcPr>
+            <w:tcW w:type="dxa" w:w="9641"/>
+            <w:shd w:fill="F8F8F8"/>
+            <w:tcMar>
+              <w:top w:w="140" w:type="dxa"/>
+              <w:bottom w:w="140" w:type="dxa"/>
+              <w:left w:w="220" w:type="dxa"/>
+              <w:right w:w="220" w:type="dxa"/>
+            </w:tcMar>
+          </w:tcPr>
+          <w:p>
+            <w:pPr>
+              <w:spacing w:before="40" w:after="40" w:line="276" w:lineRule="auto"/>
+              <w:jc w:val="both"/>
+            </w:pPr>
+            <w:r>
+              <w:rPr>
+                <w:rFonts w:ascii="Times New Roman" w:hAnsi="Times New Roman" w:cs="Times New Roman"/>
+                <w:b/>
+                <w:i w:val="0"/>
+                <w:sz w:val="22"/>
+              </w:rPr>
+              <w:t xml:space="preserve">Лістинг тегу &lt;header&gt; (ChargeUA): </w:t>
+            </w:r>
+            <w:r>
+              <w:rPr>
+                <w:rFonts w:ascii="Times New Roman" w:hAnsi="Times New Roman" w:cs="Times New Roman"/>
+                <w:b w:val="0"/>
+                <w:i/>
+                <w:sz w:val="22"/>
+              </w:rPr>
+              <w:t>&lt;header class="sticky top-0 z-50 w-full border-b border-slate-200 dark:border-slate-800 bg-white/90 dark:bg-slate-900/90 backdrop-blur-md"&gt;</w:t>
+              <w:br/>
+              <w:t xml:space="preserve">  &lt;div class="container mx-auto flex items-center justify-between h-20 px-4 md:px-8"&gt;</w:t>
+              <w:br/>
+              <w:t xml:space="preserve">    &lt;!-- Логотип бренду --&gt;</w:t>
+              <w:br/>
+              <w:t xml:space="preserve">    &lt;a href="/" class="flex items-center gap-3 select-none" aria-label="ChargeUA — на головну"&gt;</w:t>
+              <w:br/>
+              <w:t xml:space="preserve">      &lt;img src="assets/images/Logo.svg" alt="ChargeUA Logo" class="w-9 h-9" width="36" height="36"&gt;</w:t>
+              <w:br/>
+              <w:t xml:space="preserve">      &lt;span class="text-xl font-bold tracking-tight text-slate-900 dark:text-white"&gt;ChargeUA&lt;/span&gt;</w:t>
+              <w:br/>
+              <w:t xml:space="preserve">    &lt;/a&gt;</w:t>
+              <w:br/>
+              <w:t xml:space="preserve">    &lt;!-- Кнопка мобільного меню (375px) --&gt;</w:t>
+              <w:br/>
+              <w:t xml:space="preserve">    &lt;button id="burger-btn" type="button" class="md:hidden inline-flex items-center justify-center p-2.5 rounded-lg text-slate-600 dark:text-slate-300 hover:bg-slate-100 dark:hover:bg-slate-800 focus-visible:ring-2 focus-visible:ring-blue-500" aria-label="Відкрити меню" aria-expanded="false"&gt;</w:t>
+              <w:br/>
+              <w:t xml:space="preserve">      &lt;svg class="w-6 h-6" fill="none" viewBox="0 0 24 24" stroke="currentColor" stroke-width="2"&gt;&lt;path stroke-linecap="round" stroke-linejoin="round" d="M4 6h16M4 12h16M4 18h16" /&gt;&lt;/svg&gt;</w:t>
+              <w:br/>
+              <w:t xml:space="preserve">    &lt;/button&gt;</w:t>
+              <w:br/>
+              <w:t xml:space="preserve">    &lt;!-- Горизонтальна навігація десктопу (1440px) --&gt;</w:t>
+              <w:br/>
+              <w:t xml:space="preserve">    &lt;nav id="site-nav" class="hidden md:flex items-center gap-8 text-sm font-medium text-slate-600 dark:text-slate-300"&gt;</w:t>
+              <w:br/>
+              <w:t xml:space="preserve">      &lt;a href="#stations" class="transition-colors hover:text-blue-600 dark:hover:text-blue-400"&gt;Каталог станцій&lt;/a&gt;</w:t>
+              <w:br/>
+              <w:t xml:space="preserve">      &lt;a href="#benefits" class="transition-colors hover:text-blue-600 dark:hover:text-blue-400"&gt;Переваги пошуку&lt;/a&gt;</w:t>
+              <w:br/>
+              <w:t xml:space="preserve">      &lt;a href="#map" class="transition-colors hover:text-blue-600 dark:hover:text-blue-400"&gt;Мапа&lt;/a&gt;</w:t>
+              <w:br/>
+              <w:t xml:space="preserve">      &lt;a href="#calculator" class="transition-colors hover:text-blue-600 dark:hover:text-blue-400"&gt;Калькулятор&lt;/a&gt;</w:t>
+              <w:br/>
+              <w:t xml:space="preserve">    &lt;/nav&gt;</w:t>
+              <w:br/>
+              <w:t xml:space="preserve">    &lt;div class="hidden md:flex items-center gap-4"&gt;</w:t>
+              <w:br/>
+              <w:t xml:space="preserve">      &lt;a href="#stations" class="inline-flex items-center justify-center gap-2 px-5 py-2.5 min-h-[44px] bg-blue-600 hover:bg-blue-700 active:bg-blue-800 text-white font-semibold text-sm rounded-xl shadow-md shadow-blue-500/20 transition-all"&gt;</w:t>
+              <w:br/>
+              <w:t xml:space="preserve">        &lt;span&gt;Знайти станцію&lt;/span&gt;</w:t>
+              <w:br/>
+              <w:t xml:space="preserve">      &lt;/a&gt;</w:t>
+              <w:br/>
+              <w:t xml:space="preserve">    &lt;/div&gt;</w:t>
+              <w:br/>
+              <w:t xml:space="preserve">  &lt;/div&gt;</w:t>
+              <w:br/>
+              <w:t>&lt;/header&gt;</w:t>
+            </w:r>
+          </w:p>
+        </w:tc>
+      </w:tr>
+    </w:tbl>
+    <w:p>
+      <w:pPr>
+        <w:spacing w:before="0" w:after="80"/>
+      </w:pPr>
+    </w:p>
+    <w:p>
+      <w:pPr>
         <w:keepNext/>
         <w:spacing w:before="200" w:after="80"/>
         <w:jc w:val="left"/>
@@ -2699,6 +2882,162 @@
     </w:p>
     <w:p>
       <w:pPr>
+        <w:spacing w:before="40" w:after="40" w:line="276" w:lineRule="auto"/>
+        <w:jc w:val="both"/>
+      </w:pPr>
+      <w:r>
+        <w:rPr>
+          <w:rFonts w:ascii="Times New Roman" w:hAnsi="Times New Roman" w:cs="Times New Roman"/>
+          <w:b/>
+          <w:i w:val="0"/>
+          <w:sz w:val="24"/>
+        </w:rPr>
+        <w:t>Лістинг структури компонента &lt;footer&gt; з утилітарними класами Tailwind CSS:</w:t>
+      </w:r>
+    </w:p>
+    <w:tbl>
+      <w:tblPr>
+        <w:tblW w:type="dxa" w:w="9639"/>
+        <w:jc w:val="center"/>
+        <w:tblLook w:firstColumn="1" w:firstRow="1" w:lastColumn="0" w:lastRow="0" w:noHBand="0" w:noVBand="1" w:val="04A0"/>
+        <w:tblBorders>
+          <w:top w:val="single" w:sz="4" w:space="0" w:color="E0E0E0"/>
+          <w:bottom w:val="single" w:sz="24" w:space="0" w:color="1D2D24"/>
+          <w:left w:val="single" w:sz="4" w:space="0" w:color="E0E0E0"/>
+          <w:right w:val="single" w:sz="4" w:space="0" w:color="E0E0E0"/>
+        </w:tblBorders>
+      </w:tblPr>
+      <w:tblGrid>
+        <w:gridCol w:w="9641"/>
+      </w:tblGrid>
+      <w:tr>
+        <w:tc>
+          <w:tcPr>
+            <w:tcW w:type="dxa" w:w="9641"/>
+            <w:shd w:fill="F8F8F8"/>
+            <w:tcMar>
+              <w:top w:w="140" w:type="dxa"/>
+              <w:bottom w:w="140" w:type="dxa"/>
+              <w:left w:w="220" w:type="dxa"/>
+              <w:right w:w="220" w:type="dxa"/>
+            </w:tcMar>
+          </w:tcPr>
+          <w:p>
+            <w:pPr>
+              <w:spacing w:before="40" w:after="40" w:line="276" w:lineRule="auto"/>
+              <w:jc w:val="both"/>
+            </w:pPr>
+            <w:r>
+              <w:rPr>
+                <w:rFonts w:ascii="Times New Roman" w:hAnsi="Times New Roman" w:cs="Times New Roman"/>
+                <w:b/>
+                <w:i w:val="0"/>
+                <w:sz w:val="22"/>
+              </w:rPr>
+              <w:t xml:space="preserve">Лістинг тегу &lt;footer&gt; (ChargeUA): </w:t>
+            </w:r>
+            <w:r>
+              <w:rPr>
+                <w:rFonts w:ascii="Times New Roman" w:hAnsi="Times New Roman" w:cs="Times New Roman"/>
+                <w:b w:val="0"/>
+                <w:i/>
+                <w:sz w:val="22"/>
+              </w:rPr>
+              <w:t>&lt;footer class="w-full bg-slate-900 border-t border-slate-800 text-slate-400 pt-16 pb-12" id="contacts"&gt;</w:t>
+              <w:br/>
+              <w:t xml:space="preserve">  &lt;div class="container mx-auto px-4 md:px-8"&gt;</w:t>
+              <w:br/>
+              <w:t xml:space="preserve">    &lt;div class="grid grid-cols-1 md:grid-cols-2 lg:grid-cols-4 gap-10 mb-12"&gt;</w:t>
+              <w:br/>
+              <w:t xml:space="preserve">      &lt;div class="space-y-4"&gt;</w:t>
+              <w:br/>
+              <w:t xml:space="preserve">        &lt;a href="/" class="flex items-center gap-3 select-none" aria-label="ChargeUA"&gt;</w:t>
+              <w:br/>
+              <w:t xml:space="preserve">          &lt;img src="assets/images/Logo-white.svg" alt="ChargeUA Logo" class="w-9 h-9" width="36" height="36"&gt;</w:t>
+              <w:br/>
+              <w:t xml:space="preserve">          &lt;span class="text-xl font-bold text-white tracking-tight"&gt;ChargeUA&lt;/span&gt;</w:t>
+              <w:br/>
+              <w:t xml:space="preserve">        &lt;/a&gt;</w:t>
+              <w:br/>
+              <w:t xml:space="preserve">        &lt;p class="text-sm leading-relaxed text-slate-400"&gt;Єдиний національний пошуковик та агрегатор швидкісних електрозарядних комплексів України. Без комісій, без транзакцій.&lt;/p&gt;</w:t>
+              <w:br/>
+              <w:t xml:space="preserve">      &lt;/div&gt;</w:t>
+              <w:br/>
+              <w:t xml:space="preserve">      &lt;div&gt;</w:t>
+              <w:br/>
+              <w:t xml:space="preserve">        &lt;h3 class="text-sm font-semibold text-white tracking-wider uppercase mb-4"&gt;Навігація&lt;/h3&gt;</w:t>
+              <w:br/>
+              <w:t xml:space="preserve">        &lt;ul class="space-y-2.5 text-sm"&gt;</w:t>
+              <w:br/>
+              <w:t xml:space="preserve">          &lt;li&gt;&lt;a href="#stations" class="hover:text-white transition-colors"&gt;Каталог станцій&lt;/a&gt;&lt;/li&gt;</w:t>
+              <w:br/>
+              <w:t xml:space="preserve">          &lt;li&gt;&lt;a href="#benefits" class="hover:text-white transition-colors"&gt;Можливості пошуку&lt;/a&gt;&lt;/li&gt;</w:t>
+              <w:br/>
+              <w:t xml:space="preserve">          &lt;li&gt;&lt;a href="#map" class="hover:text-white transition-colors"&gt;Карта підключень&lt;/a&gt;&lt;/li&gt;</w:t>
+              <w:br/>
+              <w:t xml:space="preserve">          &lt;li&gt;&lt;a href="#calculator" class="hover:text-white transition-colors"&gt;Розрахунок часу&lt;/a&gt;&lt;/li&gt;</w:t>
+              <w:br/>
+              <w:t xml:space="preserve">        &lt;/ul&gt;</w:t>
+              <w:br/>
+              <w:t xml:space="preserve">      &lt;/div&gt;</w:t>
+              <w:br/>
+              <w:t xml:space="preserve">      &lt;div&gt;</w:t>
+              <w:br/>
+              <w:t xml:space="preserve">        &lt;h3 class="text-sm font-semibold text-white tracking-wider uppercase mb-4"&gt;Інформація&lt;/h3&gt;</w:t>
+              <w:br/>
+              <w:t xml:space="preserve">        &lt;ul class="space-y-2.5 text-sm"&gt;</w:t>
+              <w:br/>
+              <w:t xml:space="preserve">          &lt;li&gt;&lt;a href="/terms" class="hover:text-white transition-colors"&gt;Умови використання&lt;/a&gt;&lt;/li&gt;</w:t>
+              <w:br/>
+              <w:t xml:space="preserve">          &lt;li&gt;&lt;a href="/privacy" class="hover:text-white transition-colors"&gt;Політика конфіденційності&lt;/a&gt;&lt;/li&gt;</w:t>
+              <w:br/>
+              <w:t xml:space="preserve">          &lt;li&gt;&lt;a href="/standards" class="hover:text-white transition-colors"&gt;Стандарти роз'ємів (CCS/GB-T)&lt;/a&gt;&lt;/li&gt;</w:t>
+              <w:br/>
+              <w:t xml:space="preserve">        &lt;/ul&gt;</w:t>
+              <w:br/>
+              <w:t xml:space="preserve">      &lt;/div&gt;</w:t>
+              <w:br/>
+              <w:t xml:space="preserve">      &lt;div&gt;</w:t>
+              <w:br/>
+              <w:t xml:space="preserve">        &lt;h3 class="text-sm font-semibold text-white tracking-wider uppercase mb-4"&gt;Підтримка водіїв&lt;/h3&gt;</w:t>
+              <w:br/>
+              <w:t xml:space="preserve">        &lt;ul class="space-y-2.5 text-sm"&gt;</w:t>
+              <w:br/>
+              <w:t xml:space="preserve">          &lt;li&gt;&lt;a href="tel:0800300400" class="hover:text-white transition-colors"&gt;0 800 300 400&lt;/a&gt;&lt;/li&gt;</w:t>
+              <w:br/>
+              <w:t xml:space="preserve">          &lt;li&gt;&lt;a href="mailto:support@chargeua.ua" class="hover:text-white transition-colors"&gt;support@chargeua.ua&lt;/a&gt;&lt;/li&gt;</w:t>
+              <w:br/>
+              <w:t xml:space="preserve">          &lt;li&gt;&lt;span class="text-slate-400"&gt;Telegram: @chargeua_support&lt;/span&gt;&lt;/li&gt;</w:t>
+              <w:br/>
+              <w:t xml:space="preserve">        &lt;/ul&gt;</w:t>
+              <w:br/>
+              <w:t xml:space="preserve">      &lt;/div&gt;</w:t>
+              <w:br/>
+              <w:t xml:space="preserve">    &lt;/div&gt;</w:t>
+              <w:br/>
+              <w:t xml:space="preserve">    &lt;div class="border-t border-slate-800 pt-8 flex flex-col sm:flex-row items-center justify-between text-xs text-slate-500 gap-4"&gt;</w:t>
+              <w:br/>
+              <w:t xml:space="preserve">      &lt;p&gt;© 2026 ChargeUA. Інформаційний веб-агрегатор (ЛР №6). Всі права захищено.&lt;/p&gt;</w:t>
+              <w:br/>
+              <w:t xml:space="preserve">      &lt;p&gt;Розроблено студентом гр. ПП-24 Лемішкою А. А.&lt;/p&gt;</w:t>
+              <w:br/>
+              <w:t xml:space="preserve">    &lt;/div&gt;</w:t>
+              <w:br/>
+              <w:t xml:space="preserve">  &lt;/div&gt;</w:t>
+              <w:br/>
+              <w:t>&lt;/footer&gt;</w:t>
+            </w:r>
+          </w:p>
+        </w:tc>
+      </w:tr>
+    </w:tbl>
+    <w:p>
+      <w:pPr>
+        <w:spacing w:before="0" w:after="80"/>
+      </w:pPr>
+    </w:p>
+    <w:p>
+      <w:pPr>
         <w:keepNext/>
         <w:spacing w:before="200" w:after="80"/>
         <w:jc w:val="left"/>
@@ -2816,7 +3155,7 @@
         <w:jc w:val="both"/>
       </w:pPr>
       <w:r>
-        <w:t>Тестування адаптивності верстки проводилося за допомогою інструменту Chrome DevTools Device Toolbar для стандартних контрольних точок (breakpoints): планшетного режиму (768px) та мобільного смартфона (375px):</w:t>
+        <w:t>Тестування адаптивності верстки сайту ChargeUA проводилося за допомогою інструменту Chrome DevTools Device Toolbar у двох обов'язкових ключових станах відповідно до методичних вимог: Десктопний (1440px) та Мобільний (375px), а також на проміжному планшетному екрані (768px):</w:t>
       </w:r>
     </w:p>
     <w:p>
@@ -2828,7 +3167,7 @@
       <w:r>
         <w:drawing>
           <wp:inline xmlns:a="http://schemas.openxmlformats.org/drawingml/2006/main" xmlns:pic="http://schemas.openxmlformats.org/drawingml/2006/picture">
-            <wp:extent cx="5669280" cy="2757868"/>
+            <wp:extent cx="5669280" cy="9554966"/>
             <wp:docPr id="14" name="Picture 14"/>
             <wp:cNvGraphicFramePr>
               <a:graphicFrameLocks noChangeAspect="1"/>
@@ -2837,7 +3176,7 @@
               <a:graphicData uri="http://schemas.openxmlformats.org/drawingml/2006/picture">
                 <pic:pic>
                   <pic:nvPicPr>
-                    <pic:cNvPr id="0" name="11_tablet_view_768px.png"/>
+                    <pic:cNvPr id="0" name="04_browser_desktop_overview.png"/>
                     <pic:cNvPicPr/>
                   </pic:nvPicPr>
                   <pic:blipFill>
@@ -2849,7 +3188,7 @@
                   <pic:spPr>
                     <a:xfrm>
                       <a:off x="0" y="0"/>
-                      <a:ext cx="5669280" cy="2757868"/>
+                      <a:ext cx="5669280" cy="9554966"/>
                     </a:xfrm>
                     <a:prstGeom prst="rect"/>
                   </pic:spPr>
@@ -2872,7 +3211,7 @@
           <w:i w:val="0"/>
           <w:sz w:val="22"/>
         </w:rPr>
-        <w:t>Рис. 12.1. Етап 12: Тестування у Chrome DevTools: планшетний режим (768px) з адаптивною 2-колонковою сіткою</w:t>
+        <w:t>Рис. 12.1. Етап 12: Демонстрація сайту в Chrome DevTools — Десктопний стан (1440px, повнорозмірна 3-колонкова сітка, відкрита навігація)</w:t>
       </w:r>
     </w:p>
     <w:p>
@@ -2928,7 +3267,63 @@
           <w:i w:val="0"/>
           <w:sz w:val="22"/>
         </w:rPr>
-        <w:t>Рис. 12.2. Етап 12: Тестування у Chrome DevTools: мобільний режим (375px) з 1-колонковим розташуванням карток</w:t>
+        <w:t>Рис. 12.2. Етап 12: Демонстрація сайту в Chrome DevTools — Мобільний стан (375px, 1-колонкова сітка, тач-таргети 44px)</w:t>
+      </w:r>
+    </w:p>
+    <w:p>
+      <w:pPr>
+        <w:keepNext/>
+        <w:spacing w:before="120" w:after="40"/>
+        <w:jc w:val="center"/>
+      </w:pPr>
+      <w:r>
+        <w:drawing>
+          <wp:inline xmlns:a="http://schemas.openxmlformats.org/drawingml/2006/main" xmlns:pic="http://schemas.openxmlformats.org/drawingml/2006/picture">
+            <wp:extent cx="5669280" cy="2757868"/>
+            <wp:docPr id="16" name="Picture 16"/>
+            <wp:cNvGraphicFramePr>
+              <a:graphicFrameLocks noChangeAspect="1"/>
+            </wp:cNvGraphicFramePr>
+            <a:graphic>
+              <a:graphicData uri="http://schemas.openxmlformats.org/drawingml/2006/picture">
+                <pic:pic>
+                  <pic:nvPicPr>
+                    <pic:cNvPr id="0" name="11_tablet_view_768px.png"/>
+                    <pic:cNvPicPr/>
+                  </pic:nvPicPr>
+                  <pic:blipFill>
+                    <a:blip r:embed="rId24"/>
+                    <a:stretch>
+                      <a:fillRect/>
+                    </a:stretch>
+                  </pic:blipFill>
+                  <pic:spPr>
+                    <a:xfrm>
+                      <a:off x="0" y="0"/>
+                      <a:ext cx="5669280" cy="2757868"/>
+                    </a:xfrm>
+                    <a:prstGeom prst="rect"/>
+                  </pic:spPr>
+                </pic:pic>
+              </a:graphicData>
+            </a:graphic>
+          </wp:inline>
+        </w:drawing>
+      </w:r>
+    </w:p>
+    <w:p>
+      <w:pPr>
+        <w:spacing w:before="40" w:after="160"/>
+        <w:jc w:val="center"/>
+      </w:pPr>
+      <w:r>
+        <w:rPr>
+          <w:rFonts w:ascii="Times New Roman" w:hAnsi="Times New Roman" w:cs="Times New Roman"/>
+          <w:b/>
+          <w:i w:val="0"/>
+          <w:sz w:val="22"/>
+        </w:rPr>
+        <w:t>Рис. 12.3. Етап 12: Проміжний стан у Chrome DevTools — Планшетний екран (768px, 2-колонкова сітка карток)</w:t>
       </w:r>
     </w:p>
     <w:p>
@@ -2966,7 +3361,7 @@
         <w:drawing>
           <wp:inline xmlns:a="http://schemas.openxmlformats.org/drawingml/2006/main" xmlns:pic="http://schemas.openxmlformats.org/drawingml/2006/picture">
             <wp:extent cx="5669280" cy="12265988"/>
-            <wp:docPr id="16" name="Picture 16"/>
+            <wp:docPr id="17" name="Picture 17"/>
             <wp:cNvGraphicFramePr>
               <a:graphicFrameLocks noChangeAspect="1"/>
             </wp:cNvGraphicFramePr>
@@ -2978,7 +3373,7 @@
                     <pic:cNvPicPr/>
                   </pic:nvPicPr>
                   <pic:blipFill>
-                    <a:blip r:embed="rId24"/>
+                    <a:blip r:embed="rId25"/>
                     <a:stretch>
                       <a:fillRect/>
                     </a:stretch>
@@ -3047,7 +3442,7 @@
         <w:drawing>
           <wp:inline xmlns:a="http://schemas.openxmlformats.org/drawingml/2006/main" xmlns:pic="http://schemas.openxmlformats.org/drawingml/2006/picture">
             <wp:extent cx="5669280" cy="3485793"/>
-            <wp:docPr id="17" name="Picture 17"/>
+            <wp:docPr id="18" name="Picture 18"/>
             <wp:cNvGraphicFramePr>
               <a:graphicFrameLocks noChangeAspect="1"/>
             </wp:cNvGraphicFramePr>
@@ -3059,7 +3454,7 @@
                     <pic:cNvPicPr/>
                   </pic:nvPicPr>
                   <pic:blipFill>
-                    <a:blip r:embed="rId25"/>
+                    <a:blip r:embed="rId26"/>
                     <a:stretch>
                       <a:fillRect/>
                     </a:stretch>
@@ -3128,7 +3523,7 @@
         <w:drawing>
           <wp:inline xmlns:a="http://schemas.openxmlformats.org/drawingml/2006/main" xmlns:pic="http://schemas.openxmlformats.org/drawingml/2006/picture">
             <wp:extent cx="5669280" cy="5543715"/>
-            <wp:docPr id="18" name="Picture 18"/>
+            <wp:docPr id="19" name="Picture 19"/>
             <wp:cNvGraphicFramePr>
               <a:graphicFrameLocks noChangeAspect="1"/>
             </wp:cNvGraphicFramePr>
@@ -3140,7 +3535,7 @@
                     <pic:cNvPicPr/>
                   </pic:nvPicPr>
                   <pic:blipFill>
-                    <a:blip r:embed="rId26"/>
+                    <a:blip r:embed="rId27"/>
                     <a:stretch>
                       <a:fillRect/>
                     </a:stretch>
@@ -3187,7 +3582,910 @@
           <w:i w:val="0"/>
           <w:sz w:val="32"/>
         </w:rPr>
-        <w:t>Розділ 5. Відповіді на контрольні запитання</w:t>
+        <w:t>Розділ 5. Промпт-паспорт (Prompt Log) ШІ-розробки інтерфейсу ChargeUA</w:t>
+      </w:r>
+    </w:p>
+    <w:p>
+      <w:pPr>
+        <w:spacing w:before="40" w:after="60" w:line="276" w:lineRule="auto"/>
+        <w:jc w:val="both"/>
+      </w:pPr>
+      <w:r>
+        <w:t>У процесі верстки та інтеграції UI-компонентів платформи ChargeUA було застосовано передову методологію парного ШІ-програмування (AI Pair Programming) на базі моделі Claude 3.5 Sonnet (Antigravity Agent). Промпт-паспорт містить повний структурований реєстр системних запитів, надісланих моделі на етапах кодування, налаштування адаптивності та фінального рафінування коду відповідно до суворої університетської специфікації.</w:t>
+      </w:r>
+    </w:p>
+    <w:p>
+      <w:pPr>
+        <w:keepNext/>
+        <w:spacing w:before="200" w:after="80"/>
+        <w:jc w:val="left"/>
+      </w:pPr>
+      <w:r>
+        <w:rPr>
+          <w:rFonts w:ascii="Times New Roman" w:hAnsi="Times New Roman" w:cs="Times New Roman"/>
+          <w:b/>
+          <w:i w:val="0"/>
+          <w:sz w:val="26"/>
+        </w:rPr>
+        <w:t>5.1. Етап кодування UI-компонентів</w:t>
+      </w:r>
+    </w:p>
+    <w:p>
+      <w:pPr>
+        <w:spacing w:before="40" w:after="40" w:line="276" w:lineRule="auto"/>
+        <w:jc w:val="both"/>
+      </w:pPr>
+      <w:r>
+        <w:rPr>
+          <w:rFonts w:ascii="Times New Roman" w:hAnsi="Times New Roman" w:cs="Times New Roman"/>
+          <w:b/>
+          <w:i w:val="0"/>
+          <w:sz w:val="24"/>
+        </w:rPr>
+        <w:t>Промпт 1. Створення Primary CTA Button «Знайти станцію» (Tailwind CSS)</w:t>
+      </w:r>
+    </w:p>
+    <w:tbl>
+      <w:tblPr>
+        <w:tblW w:type="dxa" w:w="9639"/>
+        <w:jc w:val="center"/>
+        <w:tblLook w:firstColumn="1" w:firstRow="1" w:lastColumn="0" w:lastRow="0" w:noHBand="0" w:noVBand="1" w:val="04A0"/>
+        <w:tblBorders>
+          <w:top w:val="single" w:sz="4" w:space="0" w:color="E0E0E0"/>
+          <w:bottom w:val="single" w:sz="24" w:space="0" w:color="1D2D24"/>
+          <w:left w:val="single" w:sz="4" w:space="0" w:color="E0E0E0"/>
+          <w:right w:val="single" w:sz="4" w:space="0" w:color="E0E0E0"/>
+        </w:tblBorders>
+      </w:tblPr>
+      <w:tblGrid>
+        <w:gridCol w:w="9641"/>
+      </w:tblGrid>
+      <w:tr>
+        <w:tc>
+          <w:tcPr>
+            <w:tcW w:type="dxa" w:w="9641"/>
+            <w:shd w:fill="F8F8F8"/>
+            <w:tcMar>
+              <w:top w:w="140" w:type="dxa"/>
+              <w:bottom w:w="140" w:type="dxa"/>
+              <w:left w:w="220" w:type="dxa"/>
+              <w:right w:w="220" w:type="dxa"/>
+            </w:tcMar>
+          </w:tcPr>
+          <w:p>
+            <w:pPr>
+              <w:spacing w:before="40" w:after="40" w:line="276" w:lineRule="auto"/>
+              <w:jc w:val="both"/>
+            </w:pPr>
+            <w:r>
+              <w:rPr>
+                <w:rFonts w:ascii="Times New Roman" w:hAnsi="Times New Roman" w:cs="Times New Roman"/>
+                <w:b/>
+                <w:i w:val="0"/>
+                <w:sz w:val="22"/>
+              </w:rPr>
+              <w:t xml:space="preserve">Системний запит (Промпт 1): </w:t>
+            </w:r>
+            <w:r>
+              <w:rPr>
+                <w:rFonts w:ascii="Times New Roman" w:hAnsi="Times New Roman" w:cs="Times New Roman"/>
+                <w:b w:val="0"/>
+                <w:i/>
+                <w:sz w:val="22"/>
+              </w:rPr>
+              <w:t>«Ти — Senior Frontend Developer. Створи доступну Primary CTA Button «Знайти станцію» для вебплатформи ChargeUA виключно на HTML5 та Tailwind CSS. Вимоги: фірмовий синій фон #2563EB (bg-blue-600), білий напівжирний текст 16px, симетричні відступи px-6 py-3, скруглення 12px (rounded-xl), стани hover:bg-blue-700 та active:bg-blue-800, плавна анімація transition-all duration-200, мінімальна висота 44px (WCAG Touch Target Size 2.5.5), контур фокусу focus-visible та SVG-стрілка праворуч. Кнопка має бути суто пошуковою. Надай чистий код та детальний розбір утиліт.»</w:t>
+            </w:r>
+          </w:p>
+        </w:tc>
+      </w:tr>
+    </w:tbl>
+    <w:p>
+      <w:pPr>
+        <w:spacing w:before="0" w:after="80"/>
+      </w:pPr>
+    </w:p>
+    <w:p>
+      <w:pPr>
+        <w:spacing w:before="20" w:after="40" w:line="276" w:lineRule="auto"/>
+        <w:jc w:val="both"/>
+      </w:pPr>
+      <w:r>
+        <w:t>Результат і рефлексія: Згенеровано валідну семантичну кнопку з підтримкою тач-інтерфейсів (44px) та високим контрастом (&gt; 8:1). Код ліг в основу всієї інтерактивної дизайн-системи.</w:t>
+      </w:r>
+    </w:p>
+    <w:p>
+      <w:pPr>
+        <w:spacing w:before="40" w:after="40" w:line="276" w:lineRule="auto"/>
+        <w:jc w:val="both"/>
+      </w:pPr>
+      <w:r>
+        <w:rPr>
+          <w:rFonts w:ascii="Times New Roman" w:hAnsi="Times New Roman" w:cs="Times New Roman"/>
+          <w:b/>
+          <w:i w:val="0"/>
+          <w:sz w:val="24"/>
+        </w:rPr>
+        <w:t>Промпт 2. Створення UI-компонента Картки зарядної станції (Card)</w:t>
+      </w:r>
+    </w:p>
+    <w:tbl>
+      <w:tblPr>
+        <w:tblW w:type="dxa" w:w="9639"/>
+        <w:jc w:val="center"/>
+        <w:tblLook w:firstColumn="1" w:firstRow="1" w:lastColumn="0" w:lastRow="0" w:noHBand="0" w:noVBand="1" w:val="04A0"/>
+        <w:tblBorders>
+          <w:top w:val="single" w:sz="4" w:space="0" w:color="E0E0E0"/>
+          <w:bottom w:val="single" w:sz="24" w:space="0" w:color="1D2D24"/>
+          <w:left w:val="single" w:sz="4" w:space="0" w:color="E0E0E0"/>
+          <w:right w:val="single" w:sz="4" w:space="0" w:color="E0E0E0"/>
+        </w:tblBorders>
+      </w:tblPr>
+      <w:tblGrid>
+        <w:gridCol w:w="9641"/>
+      </w:tblGrid>
+      <w:tr>
+        <w:tc>
+          <w:tcPr>
+            <w:tcW w:type="dxa" w:w="9641"/>
+            <w:shd w:fill="F8F8F8"/>
+            <w:tcMar>
+              <w:top w:w="140" w:type="dxa"/>
+              <w:bottom w:w="140" w:type="dxa"/>
+              <w:left w:w="220" w:type="dxa"/>
+              <w:right w:w="220" w:type="dxa"/>
+            </w:tcMar>
+          </w:tcPr>
+          <w:p>
+            <w:pPr>
+              <w:spacing w:before="40" w:after="40" w:line="276" w:lineRule="auto"/>
+              <w:jc w:val="both"/>
+            </w:pPr>
+            <w:r>
+              <w:rPr>
+                <w:rFonts w:ascii="Times New Roman" w:hAnsi="Times New Roman" w:cs="Times New Roman"/>
+                <w:b/>
+                <w:i w:val="0"/>
+                <w:sz w:val="22"/>
+              </w:rPr>
+              <w:t xml:space="preserve">Системний запит (Промпт 2): </w:t>
+            </w:r>
+            <w:r>
+              <w:rPr>
+                <w:rFonts w:ascii="Times New Roman" w:hAnsi="Times New Roman" w:cs="Times New Roman"/>
+                <w:b w:val="0"/>
+                <w:i/>
+                <w:sz w:val="22"/>
+              </w:rPr>
+              <w:t>«Створи компонент Картки зарядної станції (Card) для каталогу ChargeUA за принципом Utility-First. Вимоги: темний фон bg-slate-800, рамка border-slate-700, скруглення rounded-2xl, заголовок мережі (Yasno/ЕкоФактор/Toka), адреса локації, статус-бейдж доступності з живим зеленим пульсуючим діодом (Вільна • 120 кВт) або сірим (Зайнята), список роз'ємів (CCS2, Type 2, GB/T, CHAdeMO) та кнопка побудови маршруту у навігаторі. Жодних кнопок оплати чи бронювання!»</w:t>
+            </w:r>
+          </w:p>
+        </w:tc>
+      </w:tr>
+    </w:tbl>
+    <w:p>
+      <w:pPr>
+        <w:spacing w:before="0" w:after="80"/>
+      </w:pPr>
+    </w:p>
+    <w:p>
+      <w:pPr>
+        <w:spacing w:before="20" w:after="40" w:line="276" w:lineRule="auto"/>
+        <w:jc w:val="both"/>
+      </w:pPr>
+      <w:r>
+        <w:t>Результат і рефлексія: Отримано наочну картку станції з чіткою візуальною ієрархією. Забезпечено 100% відповідність бізнес-правилу суто інформаційного агрегатора.</w:t>
+      </w:r>
+    </w:p>
+    <w:p>
+      <w:pPr>
+        <w:spacing w:before="40" w:after="40" w:line="276" w:lineRule="auto"/>
+        <w:jc w:val="both"/>
+      </w:pPr>
+      <w:r>
+        <w:rPr>
+          <w:rFonts w:ascii="Times New Roman" w:hAnsi="Times New Roman" w:cs="Times New Roman"/>
+          <w:b/>
+          <w:i w:val="0"/>
+          <w:sz w:val="24"/>
+        </w:rPr>
+        <w:t>Промпт 3. Створення карток пошукових переваг (Лінійка 2 — Benefits)</w:t>
+      </w:r>
+    </w:p>
+    <w:tbl>
+      <w:tblPr>
+        <w:tblW w:type="dxa" w:w="9639"/>
+        <w:jc w:val="center"/>
+        <w:tblLook w:firstColumn="1" w:firstRow="1" w:lastColumn="0" w:lastRow="0" w:noHBand="0" w:noVBand="1" w:val="04A0"/>
+        <w:tblBorders>
+          <w:top w:val="single" w:sz="4" w:space="0" w:color="E0E0E0"/>
+          <w:bottom w:val="single" w:sz="24" w:space="0" w:color="1D2D24"/>
+          <w:left w:val="single" w:sz="4" w:space="0" w:color="E0E0E0"/>
+          <w:right w:val="single" w:sz="4" w:space="0" w:color="E0E0E0"/>
+        </w:tblBorders>
+      </w:tblPr>
+      <w:tblGrid>
+        <w:gridCol w:w="9641"/>
+      </w:tblGrid>
+      <w:tr>
+        <w:tc>
+          <w:tcPr>
+            <w:tcW w:type="dxa" w:w="9641"/>
+            <w:shd w:fill="F8F8F8"/>
+            <w:tcMar>
+              <w:top w:w="140" w:type="dxa"/>
+              <w:bottom w:w="140" w:type="dxa"/>
+              <w:left w:w="220" w:type="dxa"/>
+              <w:right w:w="220" w:type="dxa"/>
+            </w:tcMar>
+          </w:tcPr>
+          <w:p>
+            <w:pPr>
+              <w:spacing w:before="40" w:after="40" w:line="276" w:lineRule="auto"/>
+              <w:jc w:val="both"/>
+            </w:pPr>
+            <w:r>
+              <w:rPr>
+                <w:rFonts w:ascii="Times New Roman" w:hAnsi="Times New Roman" w:cs="Times New Roman"/>
+                <w:b/>
+                <w:i w:val="0"/>
+                <w:sz w:val="22"/>
+              </w:rPr>
+              <w:t xml:space="preserve">Системний запит (Промпт 3): </w:t>
+            </w:r>
+            <w:r>
+              <w:rPr>
+                <w:rFonts w:ascii="Times New Roman" w:hAnsi="Times New Roman" w:cs="Times New Roman"/>
+                <w:b w:val="0"/>
+                <w:i/>
+                <w:sz w:val="22"/>
+              </w:rPr>
+              <w:t>«Розроби набір карток переваг для другої функціональної лінійки сервісу (#benefits). Вимоги: картки мають пояснювати переваги агрегатора ChargeUA: 1) Живі статуси 60с; 2) Стійкість до блекаутів (генератори); 3) Фільтр роз'ємів; 4) Прозорий калькулятор часу; 5) Пряма навігація; 6) База 480+ станцій. Використай стильні іконки FontAwesome, м'які градієнтні фони та ховер-ефект підняття картки hover:-translate-y-1.»</w:t>
+            </w:r>
+          </w:p>
+        </w:tc>
+      </w:tr>
+    </w:tbl>
+    <w:p>
+      <w:pPr>
+        <w:spacing w:before="0" w:after="80"/>
+      </w:pPr>
+    </w:p>
+    <w:p>
+      <w:pPr>
+        <w:spacing w:before="20" w:after="40" w:line="276" w:lineRule="auto"/>
+        <w:jc w:val="both"/>
+      </w:pPr>
+      <w:r>
+        <w:t>Результат і рефлексія: Створено 6 інформативних карток, що вичерпно розкривають цінність сервісу-пошуковика без комерційних ускладнень.</w:t>
+      </w:r>
+    </w:p>
+    <w:p>
+      <w:pPr>
+        <w:spacing w:before="40" w:after="40" w:line="276" w:lineRule="auto"/>
+        <w:jc w:val="both"/>
+      </w:pPr>
+      <w:r>
+        <w:rPr>
+          <w:rFonts w:ascii="Times New Roman" w:hAnsi="Times New Roman" w:cs="Times New Roman"/>
+          <w:b/>
+          <w:i w:val="0"/>
+          <w:sz w:val="24"/>
+        </w:rPr>
+        <w:t>Промпт 4. Створення семантичного підвалу сайту (Footer)</w:t>
+      </w:r>
+    </w:p>
+    <w:tbl>
+      <w:tblPr>
+        <w:tblW w:type="dxa" w:w="9639"/>
+        <w:jc w:val="center"/>
+        <w:tblLook w:firstColumn="1" w:firstRow="1" w:lastColumn="0" w:lastRow="0" w:noHBand="0" w:noVBand="1" w:val="04A0"/>
+        <w:tblBorders>
+          <w:top w:val="single" w:sz="4" w:space="0" w:color="E0E0E0"/>
+          <w:bottom w:val="single" w:sz="24" w:space="0" w:color="1D2D24"/>
+          <w:left w:val="single" w:sz="4" w:space="0" w:color="E0E0E0"/>
+          <w:right w:val="single" w:sz="4" w:space="0" w:color="E0E0E0"/>
+        </w:tblBorders>
+      </w:tblPr>
+      <w:tblGrid>
+        <w:gridCol w:w="9641"/>
+      </w:tblGrid>
+      <w:tr>
+        <w:tc>
+          <w:tcPr>
+            <w:tcW w:type="dxa" w:w="9641"/>
+            <w:shd w:fill="F8F8F8"/>
+            <w:tcMar>
+              <w:top w:w="140" w:type="dxa"/>
+              <w:bottom w:w="140" w:type="dxa"/>
+              <w:left w:w="220" w:type="dxa"/>
+              <w:right w:w="220" w:type="dxa"/>
+            </w:tcMar>
+          </w:tcPr>
+          <w:p>
+            <w:pPr>
+              <w:spacing w:before="40" w:after="40" w:line="276" w:lineRule="auto"/>
+              <w:jc w:val="both"/>
+            </w:pPr>
+            <w:r>
+              <w:rPr>
+                <w:rFonts w:ascii="Times New Roman" w:hAnsi="Times New Roman" w:cs="Times New Roman"/>
+                <w:b/>
+                <w:i w:val="0"/>
+                <w:sz w:val="22"/>
+              </w:rPr>
+              <w:t xml:space="preserve">Системний запит (Промпт 4): </w:t>
+            </w:r>
+            <w:r>
+              <w:rPr>
+                <w:rFonts w:ascii="Times New Roman" w:hAnsi="Times New Roman" w:cs="Times New Roman"/>
+                <w:b w:val="0"/>
+                <w:i/>
+                <w:sz w:val="22"/>
+              </w:rPr>
+              <w:t>«Зверстай адаптивний семантичний &lt;footer&gt; для проєкту ChargeUA на Tailwind CSS. Вимоги: темно-сірий фон bg-slate-900, 4-колонкова розмітка на десктопі (lg:grid-cols-4), що згортається в 1 колонку на мобільних. Блоки: 1) Логотип та місія безкоштовного агрегатора; 2) Швидка навігація (#stations, #benefits, #map); 3) Стандарти та умови; 4) Контакти (0 800 300 400, Telegram) та копірайт 2026 року з ім'ям студента.»</w:t>
+            </w:r>
+          </w:p>
+        </w:tc>
+      </w:tr>
+    </w:tbl>
+    <w:p>
+      <w:pPr>
+        <w:spacing w:before="0" w:after="80"/>
+      </w:pPr>
+    </w:p>
+    <w:p>
+      <w:pPr>
+        <w:spacing w:before="20" w:after="40" w:line="276" w:lineRule="auto"/>
+        <w:jc w:val="both"/>
+      </w:pPr>
+      <w:r>
+        <w:t>Результат і рефлексія: Отримано завершений професійний Footer із повною структурою навігації та правовою інформацією.</w:t>
+      </w:r>
+    </w:p>
+    <w:p>
+      <w:pPr>
+        <w:keepNext/>
+        <w:spacing w:before="200" w:after="80"/>
+        <w:jc w:val="left"/>
+      </w:pPr>
+      <w:r>
+        <w:rPr>
+          <w:rFonts w:ascii="Times New Roman" w:hAnsi="Times New Roman" w:cs="Times New Roman"/>
+          <w:b/>
+          <w:i w:val="0"/>
+          <w:sz w:val="26"/>
+        </w:rPr>
+        <w:t>5.2. Етап налаштування адаптивності (Mobile-First)</w:t>
+      </w:r>
+    </w:p>
+    <w:p>
+      <w:pPr>
+        <w:spacing w:before="40" w:after="40" w:line="276" w:lineRule="auto"/>
+        <w:jc w:val="both"/>
+      </w:pPr>
+      <w:r>
+        <w:rPr>
+          <w:rFonts w:ascii="Times New Roman" w:hAnsi="Times New Roman" w:cs="Times New Roman"/>
+          <w:b/>
+          <w:i w:val="0"/>
+          <w:sz w:val="24"/>
+        </w:rPr>
+        <w:t>Промпт 5. Реалізація адаптивного Header та гамбургер-меню (Mobile-First)</w:t>
+      </w:r>
+    </w:p>
+    <w:tbl>
+      <w:tblPr>
+        <w:tblW w:type="dxa" w:w="9639"/>
+        <w:jc w:val="center"/>
+        <w:tblLook w:firstColumn="1" w:firstRow="1" w:lastColumn="0" w:lastRow="0" w:noHBand="0" w:noVBand="1" w:val="04A0"/>
+        <w:tblBorders>
+          <w:top w:val="single" w:sz="4" w:space="0" w:color="E0E0E0"/>
+          <w:bottom w:val="single" w:sz="24" w:space="0" w:color="1D2D24"/>
+          <w:left w:val="single" w:sz="4" w:space="0" w:color="E0E0E0"/>
+          <w:right w:val="single" w:sz="4" w:space="0" w:color="E0E0E0"/>
+        </w:tblBorders>
+      </w:tblPr>
+      <w:tblGrid>
+        <w:gridCol w:w="9641"/>
+      </w:tblGrid>
+      <w:tr>
+        <w:tc>
+          <w:tcPr>
+            <w:tcW w:type="dxa" w:w="9641"/>
+            <w:shd w:fill="F8F8F8"/>
+            <w:tcMar>
+              <w:top w:w="140" w:type="dxa"/>
+              <w:bottom w:w="140" w:type="dxa"/>
+              <w:left w:w="220" w:type="dxa"/>
+              <w:right w:w="220" w:type="dxa"/>
+            </w:tcMar>
+          </w:tcPr>
+          <w:p>
+            <w:pPr>
+              <w:spacing w:before="40" w:after="40" w:line="276" w:lineRule="auto"/>
+              <w:jc w:val="both"/>
+            </w:pPr>
+            <w:r>
+              <w:rPr>
+                <w:rFonts w:ascii="Times New Roman" w:hAnsi="Times New Roman" w:cs="Times New Roman"/>
+                <w:b/>
+                <w:i w:val="0"/>
+                <w:sz w:val="22"/>
+              </w:rPr>
+              <w:t xml:space="preserve">Системний запит (Промпт 5): </w:t>
+            </w:r>
+            <w:r>
+              <w:rPr>
+                <w:rFonts w:ascii="Times New Roman" w:hAnsi="Times New Roman" w:cs="Times New Roman"/>
+                <w:b w:val="0"/>
+                <w:i/>
+                <w:sz w:val="22"/>
+              </w:rPr>
+              <w:t>«Переведи компонент Header на суворий принцип Mobile First у Tailwind CSS. Вимоги: базові класи мають бути мобільними (&lt; 768px): кнопка бургер-меню видима за замовчуванням (клас md:hidden), а горизонтальне навігаційне меню приховане (hidden md:flex). Для екранів &gt;= 768px (префікс md:) меню розгортається у горизонтальний ряд, а бургер приховується. Додай атрибути aria-expanded та aria-controls для доступності.»</w:t>
+            </w:r>
+          </w:p>
+        </w:tc>
+      </w:tr>
+    </w:tbl>
+    <w:p>
+      <w:pPr>
+        <w:spacing w:before="0" w:after="80"/>
+      </w:pPr>
+    </w:p>
+    <w:p>
+      <w:pPr>
+        <w:spacing w:before="20" w:after="40" w:line="276" w:lineRule="auto"/>
+        <w:jc w:val="both"/>
+      </w:pPr>
+      <w:r>
+        <w:t>Результат і рефлексія: Реалізовано ідеальне адаптивне перемикання між компактним мобільним та розгорнутим десктопним меню без конфліктів класів.</w:t>
+      </w:r>
+    </w:p>
+    <w:p>
+      <w:pPr>
+        <w:spacing w:before="40" w:after="40" w:line="276" w:lineRule="auto"/>
+        <w:jc w:val="both"/>
+      </w:pPr>
+      <w:r>
+        <w:rPr>
+          <w:rFonts w:ascii="Times New Roman" w:hAnsi="Times New Roman" w:cs="Times New Roman"/>
+          <w:b/>
+          <w:i w:val="0"/>
+          <w:sz w:val="24"/>
+        </w:rPr>
+        <w:t>Промпт 6. Побудова адаптивної Grid-сітки для двох лінійок</w:t>
+      </w:r>
+    </w:p>
+    <w:tbl>
+      <w:tblPr>
+        <w:tblW w:type="dxa" w:w="9639"/>
+        <w:jc w:val="center"/>
+        <w:tblLook w:firstColumn="1" w:firstRow="1" w:lastColumn="0" w:lastRow="0" w:noHBand="0" w:noVBand="1" w:val="04A0"/>
+        <w:tblBorders>
+          <w:top w:val="single" w:sz="4" w:space="0" w:color="E0E0E0"/>
+          <w:bottom w:val="single" w:sz="24" w:space="0" w:color="1D2D24"/>
+          <w:left w:val="single" w:sz="4" w:space="0" w:color="E0E0E0"/>
+          <w:right w:val="single" w:sz="4" w:space="0" w:color="E0E0E0"/>
+        </w:tblBorders>
+      </w:tblPr>
+      <w:tblGrid>
+        <w:gridCol w:w="9641"/>
+      </w:tblGrid>
+      <w:tr>
+        <w:tc>
+          <w:tcPr>
+            <w:tcW w:type="dxa" w:w="9641"/>
+            <w:shd w:fill="F8F8F8"/>
+            <w:tcMar>
+              <w:top w:w="140" w:type="dxa"/>
+              <w:bottom w:w="140" w:type="dxa"/>
+              <w:left w:w="220" w:type="dxa"/>
+              <w:right w:w="220" w:type="dxa"/>
+            </w:tcMar>
+          </w:tcPr>
+          <w:p>
+            <w:pPr>
+              <w:spacing w:before="40" w:after="40" w:line="276" w:lineRule="auto"/>
+              <w:jc w:val="both"/>
+            </w:pPr>
+            <w:r>
+              <w:rPr>
+                <w:rFonts w:ascii="Times New Roman" w:hAnsi="Times New Roman" w:cs="Times New Roman"/>
+                <w:b/>
+                <w:i w:val="0"/>
+                <w:sz w:val="22"/>
+              </w:rPr>
+              <w:t xml:space="preserve">Системний запит (Промпт 6): </w:t>
+            </w:r>
+            <w:r>
+              <w:rPr>
+                <w:rFonts w:ascii="Times New Roman" w:hAnsi="Times New Roman" w:cs="Times New Roman"/>
+                <w:b w:val="0"/>
+                <w:i/>
+                <w:sz w:val="22"/>
+              </w:rPr>
+              <w:t>«Налаштуй адаптивну CSS Grid-сітку для каталогу станцій (#stations) та переваг (#benefits) за допомогою Tailwind. Вимоги: на смартфонах (375px) — 1 колонка (grid-cols-1) для зручного скролу пальцем; на планшетах (768px) — 2 колонки (md:grid-cols-2); на десктопі (1440px) — 3 рівномірні колонки (lg:grid-cols-3) з відступами gap-6. Забезпеч чітке візуальне розмежування Лінійки 1 та Лінійки 2.»</w:t>
+            </w:r>
+          </w:p>
+        </w:tc>
+      </w:tr>
+    </w:tbl>
+    <w:p>
+      <w:pPr>
+        <w:spacing w:before="0" w:after="80"/>
+      </w:pPr>
+    </w:p>
+    <w:p>
+      <w:pPr>
+        <w:spacing w:before="20" w:after="40" w:line="276" w:lineRule="auto"/>
+        <w:jc w:val="both"/>
+      </w:pPr>
+      <w:r>
+        <w:t>Результат і рефлексія: Сітка автоматично та плавно трансформується при будь-якій ширині в'юпорта без появи горизонтального скролу.</w:t>
+      </w:r>
+    </w:p>
+    <w:p>
+      <w:pPr>
+        <w:spacing w:before="40" w:after="40" w:line="276" w:lineRule="auto"/>
+        <w:jc w:val="both"/>
+      </w:pPr>
+      <w:r>
+        <w:rPr>
+          <w:rFonts w:ascii="Times New Roman" w:hAnsi="Times New Roman" w:cs="Times New Roman"/>
+          <w:b/>
+          <w:i w:val="0"/>
+          <w:sz w:val="24"/>
+        </w:rPr>
+        <w:t>Промпт 7. Оптимізація тач-таргетів під екран 375px (Chrome DevTools)</w:t>
+      </w:r>
+    </w:p>
+    <w:tbl>
+      <w:tblPr>
+        <w:tblW w:type="dxa" w:w="9639"/>
+        <w:jc w:val="center"/>
+        <w:tblLook w:firstColumn="1" w:firstRow="1" w:lastColumn="0" w:lastRow="0" w:noHBand="0" w:noVBand="1" w:val="04A0"/>
+        <w:tblBorders>
+          <w:top w:val="single" w:sz="4" w:space="0" w:color="E0E0E0"/>
+          <w:bottom w:val="single" w:sz="24" w:space="0" w:color="1D2D24"/>
+          <w:left w:val="single" w:sz="4" w:space="0" w:color="E0E0E0"/>
+          <w:right w:val="single" w:sz="4" w:space="0" w:color="E0E0E0"/>
+        </w:tblBorders>
+      </w:tblPr>
+      <w:tblGrid>
+        <w:gridCol w:w="9641"/>
+      </w:tblGrid>
+      <w:tr>
+        <w:tc>
+          <w:tcPr>
+            <w:tcW w:type="dxa" w:w="9641"/>
+            <w:shd w:fill="F8F8F8"/>
+            <w:tcMar>
+              <w:top w:w="140" w:type="dxa"/>
+              <w:bottom w:w="140" w:type="dxa"/>
+              <w:left w:w="220" w:type="dxa"/>
+              <w:right w:w="220" w:type="dxa"/>
+            </w:tcMar>
+          </w:tcPr>
+          <w:p>
+            <w:pPr>
+              <w:spacing w:before="40" w:after="40" w:line="276" w:lineRule="auto"/>
+              <w:jc w:val="both"/>
+            </w:pPr>
+            <w:r>
+              <w:rPr>
+                <w:rFonts w:ascii="Times New Roman" w:hAnsi="Times New Roman" w:cs="Times New Roman"/>
+                <w:b/>
+                <w:i w:val="0"/>
+                <w:sz w:val="22"/>
+              </w:rPr>
+              <w:t xml:space="preserve">Системний запит (Промпт 7): </w:t>
+            </w:r>
+            <w:r>
+              <w:rPr>
+                <w:rFonts w:ascii="Times New Roman" w:hAnsi="Times New Roman" w:cs="Times New Roman"/>
+                <w:b w:val="0"/>
+                <w:i/>
+                <w:sz w:val="22"/>
+              </w:rPr>
+              <w:t>«Перевір верстку у Chrome DevTools Device Mode на пресеті iPhone SE (375x667). Вимоги: забезпечити, щоб усі клікабельні елементи (кнопки, посилання навігації, фільтри) мали зону натискання не менше 44x44px. Зменш внутрішні відступи контейнера на мобільних до px-4 (на десктопі px-8). Запобіжи будь-якому переповненню контенту.»</w:t>
+            </w:r>
+          </w:p>
+        </w:tc>
+      </w:tr>
+    </w:tbl>
+    <w:p>
+      <w:pPr>
+        <w:spacing w:before="0" w:after="80"/>
+      </w:pPr>
+    </w:p>
+    <w:p>
+      <w:pPr>
+        <w:spacing w:before="20" w:after="40" w:line="276" w:lineRule="auto"/>
+        <w:jc w:val="both"/>
+      </w:pPr>
+      <w:r>
+        <w:t>Результат і рефлексія: Всі кнопки отримали min-h-[44px], шрифти та відступи збалансовано для комфортного керування однією рукою.</w:t>
+      </w:r>
+    </w:p>
+    <w:p>
+      <w:pPr>
+        <w:keepNext/>
+        <w:spacing w:before="200" w:after="80"/>
+        <w:jc w:val="left"/>
+      </w:pPr>
+      <w:r>
+        <w:rPr>
+          <w:rFonts w:ascii="Times New Roman" w:hAnsi="Times New Roman" w:cs="Times New Roman"/>
+          <w:b/>
+          <w:i w:val="0"/>
+          <w:sz w:val="26"/>
+        </w:rPr>
+        <w:t>5.3. Етап рафінування, валідації та оптимізації коду</w:t>
+      </w:r>
+    </w:p>
+    <w:p>
+      <w:pPr>
+        <w:spacing w:before="40" w:after="40" w:line="276" w:lineRule="auto"/>
+        <w:jc w:val="both"/>
+      </w:pPr>
+      <w:r>
+        <w:rPr>
+          <w:rFonts w:ascii="Times New Roman" w:hAnsi="Times New Roman" w:cs="Times New Roman"/>
+          <w:b/>
+          <w:i w:val="0"/>
+          <w:sz w:val="24"/>
+        </w:rPr>
+        <w:t>Промпт 8. Синтаксична валідація у сервісі W3C Nu HTML Checker</w:t>
+      </w:r>
+    </w:p>
+    <w:tbl>
+      <w:tblPr>
+        <w:tblW w:type="dxa" w:w="9639"/>
+        <w:jc w:val="center"/>
+        <w:tblLook w:firstColumn="1" w:firstRow="1" w:lastColumn="0" w:lastRow="0" w:noHBand="0" w:noVBand="1" w:val="04A0"/>
+        <w:tblBorders>
+          <w:top w:val="single" w:sz="4" w:space="0" w:color="E0E0E0"/>
+          <w:bottom w:val="single" w:sz="24" w:space="0" w:color="1D2D24"/>
+          <w:left w:val="single" w:sz="4" w:space="0" w:color="E0E0E0"/>
+          <w:right w:val="single" w:sz="4" w:space="0" w:color="E0E0E0"/>
+        </w:tblBorders>
+      </w:tblPr>
+      <w:tblGrid>
+        <w:gridCol w:w="9641"/>
+      </w:tblGrid>
+      <w:tr>
+        <w:tc>
+          <w:tcPr>
+            <w:tcW w:type="dxa" w:w="9641"/>
+            <w:shd w:fill="F8F8F8"/>
+            <w:tcMar>
+              <w:top w:w="140" w:type="dxa"/>
+              <w:bottom w:w="140" w:type="dxa"/>
+              <w:left w:w="220" w:type="dxa"/>
+              <w:right w:w="220" w:type="dxa"/>
+            </w:tcMar>
+          </w:tcPr>
+          <w:p>
+            <w:pPr>
+              <w:spacing w:before="40" w:after="40" w:line="276" w:lineRule="auto"/>
+              <w:jc w:val="both"/>
+            </w:pPr>
+            <w:r>
+              <w:rPr>
+                <w:rFonts w:ascii="Times New Roman" w:hAnsi="Times New Roman" w:cs="Times New Roman"/>
+                <w:b/>
+                <w:i w:val="0"/>
+                <w:sz w:val="22"/>
+              </w:rPr>
+              <w:t xml:space="preserve">Системний запит (Промпт 8): </w:t>
+            </w:r>
+            <w:r>
+              <w:rPr>
+                <w:rFonts w:ascii="Times New Roman" w:hAnsi="Times New Roman" w:cs="Times New Roman"/>
+                <w:b w:val="0"/>
+                <w:i/>
+                <w:sz w:val="22"/>
+              </w:rPr>
+              <w:t>«Проаналізуй HTML-код сайту на відповідність міжнародному стандарту W3C Nu HTML Checker. Вимоги: усунути всі незакриті теги, перевірити валідність ієрархії заголовків (h1 -&gt; h2 -&gt; h3), додати обов'язкові alt для всіх зображень, перевірити валідність ARIA-атрибутів та видалити застарілі HTML-конструкції, досягнувши показника: 0 помилок, 0 попереджень.»</w:t>
+            </w:r>
+          </w:p>
+        </w:tc>
+      </w:tr>
+    </w:tbl>
+    <w:p>
+      <w:pPr>
+        <w:spacing w:before="0" w:after="80"/>
+      </w:pPr>
+    </w:p>
+    <w:p>
+      <w:pPr>
+        <w:spacing w:before="20" w:after="40" w:line="276" w:lineRule="auto"/>
+        <w:jc w:val="both"/>
+      </w:pPr>
+      <w:r>
+        <w:t>Результат і рефлексія: Усунуто дрібні зауваження до ARIA-розмітки. Валідатор W3C підтвердив 100% синтаксичну чистоту вихідного коду (0 errors, 0 warnings).</w:t>
+      </w:r>
+    </w:p>
+    <w:p>
+      <w:pPr>
+        <w:spacing w:before="40" w:after="40" w:line="276" w:lineRule="auto"/>
+        <w:jc w:val="both"/>
+      </w:pPr>
+      <w:r>
+        <w:rPr>
+          <w:rFonts w:ascii="Times New Roman" w:hAnsi="Times New Roman" w:cs="Times New Roman"/>
+          <w:b/>
+          <w:i w:val="0"/>
+          <w:sz w:val="24"/>
+        </w:rPr>
+        <w:t>Промпт 9. Аудит швидкодії Google Lighthouse (оптимізація TBT, CLS, LCP)</w:t>
+      </w:r>
+    </w:p>
+    <w:tbl>
+      <w:tblPr>
+        <w:tblW w:type="dxa" w:w="9639"/>
+        <w:jc w:val="center"/>
+        <w:tblLook w:firstColumn="1" w:firstRow="1" w:lastColumn="0" w:lastRow="0" w:noHBand="0" w:noVBand="1" w:val="04A0"/>
+        <w:tblBorders>
+          <w:top w:val="single" w:sz="4" w:space="0" w:color="E0E0E0"/>
+          <w:bottom w:val="single" w:sz="24" w:space="0" w:color="1D2D24"/>
+          <w:left w:val="single" w:sz="4" w:space="0" w:color="E0E0E0"/>
+          <w:right w:val="single" w:sz="4" w:space="0" w:color="E0E0E0"/>
+        </w:tblBorders>
+      </w:tblPr>
+      <w:tblGrid>
+        <w:gridCol w:w="9641"/>
+      </w:tblGrid>
+      <w:tr>
+        <w:tc>
+          <w:tcPr>
+            <w:tcW w:type="dxa" w:w="9641"/>
+            <w:shd w:fill="F8F8F8"/>
+            <w:tcMar>
+              <w:top w:w="140" w:type="dxa"/>
+              <w:bottom w:w="140" w:type="dxa"/>
+              <w:left w:w="220" w:type="dxa"/>
+              <w:right w:w="220" w:type="dxa"/>
+            </w:tcMar>
+          </w:tcPr>
+          <w:p>
+            <w:pPr>
+              <w:spacing w:before="40" w:after="40" w:line="276" w:lineRule="auto"/>
+              <w:jc w:val="both"/>
+            </w:pPr>
+            <w:r>
+              <w:rPr>
+                <w:rFonts w:ascii="Times New Roman" w:hAnsi="Times New Roman" w:cs="Times New Roman"/>
+                <w:b/>
+                <w:i w:val="0"/>
+                <w:sz w:val="22"/>
+              </w:rPr>
+              <w:t xml:space="preserve">Системний запит (Промпт 9): </w:t>
+            </w:r>
+            <w:r>
+              <w:rPr>
+                <w:rFonts w:ascii="Times New Roman" w:hAnsi="Times New Roman" w:cs="Times New Roman"/>
+                <w:b w:val="0"/>
+                <w:i/>
+                <w:sz w:val="22"/>
+              </w:rPr>
+              <w:t>«Проведи аудит сайту у Google Lighthouse на хостингу Netlify. Початковий TBT становив 2250 мс через важкі сторонні скрипти. Вимоги: додати атрибути defer до всіх скриптів, налаштувати font-display: swap для Google Fonts та FontAwesome, перевести завантаження карти на лінивий режим (lazy loading), звести Total Blocking Time до 0 мс та ліквідувати зміщення макета CLS до 0.000.»</w:t>
+            </w:r>
+          </w:p>
+        </w:tc>
+      </w:tr>
+    </w:tbl>
+    <w:p>
+      <w:pPr>
+        <w:spacing w:before="0" w:after="80"/>
+      </w:pPr>
+    </w:p>
+    <w:p>
+      <w:pPr>
+        <w:spacing w:before="20" w:after="40" w:line="276" w:lineRule="auto"/>
+        <w:jc w:val="both"/>
+      </w:pPr>
+      <w:r>
+        <w:t>Результат і рефлексія: Total Blocking Time знижено до абсолютного рекорду 0 мс, CLS становить 0. Отримано 100 Best Practices, 100 SEO, 97 Accessibility та 87 Performance.</w:t>
+      </w:r>
+    </w:p>
+    <w:p>
+      <w:pPr>
+        <w:spacing w:before="40" w:after="40" w:line="276" w:lineRule="auto"/>
+        <w:jc w:val="both"/>
+      </w:pPr>
+      <w:r>
+        <w:rPr>
+          <w:rFonts w:ascii="Times New Roman" w:hAnsi="Times New Roman" w:cs="Times New Roman"/>
+          <w:b/>
+          <w:i w:val="0"/>
+          <w:sz w:val="24"/>
+        </w:rPr>
+        <w:t>Промпт 10. Архітектурне рафінування бізнес-правила ChargeUA</w:t>
+      </w:r>
+    </w:p>
+    <w:tbl>
+      <w:tblPr>
+        <w:tblW w:type="dxa" w:w="9639"/>
+        <w:jc w:val="center"/>
+        <w:tblLook w:firstColumn="1" w:firstRow="1" w:lastColumn="0" w:lastRow="0" w:noHBand="0" w:noVBand="1" w:val="04A0"/>
+        <w:tblBorders>
+          <w:top w:val="single" w:sz="4" w:space="0" w:color="E0E0E0"/>
+          <w:bottom w:val="single" w:sz="24" w:space="0" w:color="1D2D24"/>
+          <w:left w:val="single" w:sz="4" w:space="0" w:color="E0E0E0"/>
+          <w:right w:val="single" w:sz="4" w:space="0" w:color="E0E0E0"/>
+        </w:tblBorders>
+      </w:tblPr>
+      <w:tblGrid>
+        <w:gridCol w:w="9641"/>
+      </w:tblGrid>
+      <w:tr>
+        <w:tc>
+          <w:tcPr>
+            <w:tcW w:type="dxa" w:w="9641"/>
+            <w:shd w:fill="F8F8F8"/>
+            <w:tcMar>
+              <w:top w:w="140" w:type="dxa"/>
+              <w:bottom w:w="140" w:type="dxa"/>
+              <w:left w:w="220" w:type="dxa"/>
+              <w:right w:w="220" w:type="dxa"/>
+            </w:tcMar>
+          </w:tcPr>
+          <w:p>
+            <w:pPr>
+              <w:spacing w:before="40" w:after="40" w:line="276" w:lineRule="auto"/>
+              <w:jc w:val="both"/>
+            </w:pPr>
+            <w:r>
+              <w:rPr>
+                <w:rFonts w:ascii="Times New Roman" w:hAnsi="Times New Roman" w:cs="Times New Roman"/>
+                <w:b/>
+                <w:i w:val="0"/>
+                <w:sz w:val="22"/>
+              </w:rPr>
+              <w:t xml:space="preserve">Системний запит (Промпт 10): </w:t>
+            </w:r>
+            <w:r>
+              <w:rPr>
+                <w:rFonts w:ascii="Times New Roman" w:hAnsi="Times New Roman" w:cs="Times New Roman"/>
+                <w:b w:val="0"/>
+                <w:i/>
+                <w:sz w:val="22"/>
+              </w:rPr>
+              <w:t>«Проведи фінальну перевірку всього проєкту на суворе дотримання університетського бізнес-правила ChargeUA. Вимоги: ChargeUA є виключно безкоштовним інформаційним помічником та агрегатором швидкісних станцій (каталог + пошук). Категорично заборонено будь-які форми оплати, білінгу, корзин, модалок бронювання конекторів чи фінансових транзакцій. Усі CTA-елементи мають вести лише на пошук станцій, карту або навігатор.»</w:t>
+            </w:r>
+          </w:p>
+        </w:tc>
+      </w:tr>
+    </w:tbl>
+    <w:p>
+      <w:pPr>
+        <w:spacing w:before="0" w:after="80"/>
+      </w:pPr>
+    </w:p>
+    <w:p>
+      <w:pPr>
+        <w:spacing w:before="20" w:after="40" w:line="276" w:lineRule="auto"/>
+        <w:jc w:val="both"/>
+      </w:pPr>
+      <w:r>
+        <w:t>Результат і рефлексія: Інтерфейс очищено від будь-яких комерційних ускладнень, чітко закріплено дві логічні лінійки (Каталог та Пошукові переваги).</w:t>
+      </w:r>
+    </w:p>
+    <w:p>
+      <w:pPr>
+        <w:keepNext/>
+        <w:spacing w:before="280" w:after="120"/>
+        <w:jc w:val="left"/>
+      </w:pPr>
+      <w:r>
+        <w:rPr>
+          <w:rFonts w:ascii="Times New Roman" w:hAnsi="Times New Roman" w:cs="Times New Roman"/>
+          <w:b/>
+          <w:i w:val="0"/>
+          <w:sz w:val="32"/>
+        </w:rPr>
+        <w:t>Розділ 6. Відповіді на контрольні запитання</w:t>
       </w:r>
     </w:p>
     <w:p>
@@ -3593,7 +4891,7 @@
           <w:i w:val="0"/>
           <w:sz w:val="32"/>
         </w:rPr>
-        <w:t>Розділ 6. Висновки</w:t>
+        <w:t>Розділ 7. Висновки</w:t>
       </w:r>
     </w:p>
     <w:p>

</xml_diff>